<commit_message>
Documentación Fase 3 actualizada
</commit_message>
<xml_diff>
--- a/Fase 3/Evidencias Proyecto/Evidencias de documentación/01-RESUMEN PROYECTO DE GESTION.docx
+++ b/Fase 3/Evidencias Proyecto/Evidencias de documentación/01-RESUMEN PROYECTO DE GESTION.docx
@@ -386,7 +386,7 @@
                 <w:szCs w:val="22"/>
                 <w:rtl w:val="0"/>
               </w:rPr>
-              <w:t xml:space="preserve">Actualmente, la pyme Cordillera Pets gestiona sus ventas a través de Instagram, WhatsApp y Marketplace a través de anuncios, sin contar con una sucursal física, sino únicamente con una bodega ubicada en San Miguel. Este sistema limita la visibilidad de la marca, dificulta el control de stock y genera una gestión poco organizada de los pedidos. Nosotros como equipo queremos brindar un nuevo diseño e implementación de una plataforma web e-commerce para la pyme Cordillera Pets para que los clientes puedan acceder a un catálogo completo de productos, realizar compras en línea de manera rápida y segura, además de recibir notificaciones automáticas de sus pedidos por correo electrónico. Una de las principales propuestas de valor es que la compra será más ágil y autónoma, ya que el cliente no tendrá que esperar la disponibilidad de atención por WhatsApp, Instagram o Marketplace, sino que podrá realizar su pedido en cualquier momento del día.</w:t>
+              <w:t xml:space="preserve">Actualmente, la pyme Cordillera Pets gestiona sus ventas a través de Instagram, WhatsApp y Marketplace mediante anuncios, sin contar con una sucursal física, sino únicamente con una bodega ubicada en San Miguel. Este sistema limita la visibilidad de la marca, dificulta el control de stock y genera una gestión poco organizada de los pedidos.</w:t>
             </w:r>
           </w:p>
           <w:p>
@@ -422,7 +422,7 @@
                 <w:szCs w:val="22"/>
                 <w:rtl w:val="0"/>
               </w:rPr>
-              <w:t xml:space="preserve">Por otra parte, el dueño contará con un panel de administración que le permitirá centralizar la gestión de productos, stock y pedidos, mejorando el control y  optimizando los tiempos. Nuestro objetivo como equipo es brindar una solución que no solo digitalice los procesos de venta, sino que también marquen un impacto real en la pyme, entregando una herramienta que profesionalice su gestión, aumente la confianza de los clientes y potencie su alcance en el mercado. Con esta propuesta de plataforma a Cordilleras Pets podrá migrar desde un sistema artesanal hacia un modelo moderno, rápido y escalable, fortaleciendo competitividad y aportando valor al negocio.</w:t>
+              <w:t xml:space="preserve">Este proyecto busca diseñar e implementar una plataforma web e-commerce profesional para Cordillera Pets que permita a los clientes acceder a un catálogo completo de productos, realizar compras en línea de manera rápida y segura, además de recibir notificaciones automáticas de sus pedidos por correo electrónico.</w:t>
             </w:r>
           </w:p>
           <w:p>
@@ -499,6 +499,7 @@
               <w:pStyle w:val="Heading1"/>
               <w:keepNext w:val="0"/>
               <w:keepLines w:val="0"/>
+              <w:ind w:firstLine="0"/>
               <w:rPr/>
             </w:pPr>
             <w:bookmarkStart w:colFirst="0" w:colLast="0" w:name="_heading=h.wsffzyem0c1u" w:id="1"/>
@@ -527,7 +528,7 @@
                 <w:szCs w:val="22"/>
                 <w:rtl w:val="0"/>
               </w:rPr>
-              <w:t xml:space="preserve">Implementar una plataforma web e-commerce para Cordillera Pets que no solo digitalice, sino que también automatice los procesos de venta, gestión de productos y control de pedidos, optimizando la eficiencia operativa del negocio. La plataforma brinda una solución que está orientada a ofrecer alta disponibilidad en las opciones de compra, permitiendo que los clientes puedan acceder al catálogo, realicen sus pedidos de manera rápida, autónoma y en cualquier momento, sin depender de la atención manual mejorando significativamente su experiencia de compra y aumentando la competitividad de la pyme en el mercado digital.</w:t>
+              <w:t xml:space="preserve">Implementar una plataforma web e-commerce profesional para Cordillera Pets que no solo digitalice, sino que también automatice los procesos de venta, gestión de productos y control de pedidos optimizando la eficiencia operativa del negocio. La plataforma está orientada a ofrecer alta disponibilidad en las opciones de compra permitiendo que los clientes puedan acceder al catálogo, realicen sus pedidos de manera rápida, autónoma y en cualquier momento, sin depender de la atención manual, mejorando significativamente su experiencia de compra y aumentando la competitividad de la pyme en el mercado digital.</w:t>
             </w:r>
           </w:p>
           <w:p>
@@ -535,6 +536,7 @@
               <w:pStyle w:val="Heading1"/>
               <w:keepNext w:val="0"/>
               <w:keepLines w:val="0"/>
+              <w:ind w:firstLine="0"/>
               <w:rPr/>
             </w:pPr>
             <w:bookmarkStart w:colFirst="0" w:colLast="0" w:name="_heading=h.i86f0nbdlpib" w:id="2"/>
@@ -548,11 +550,13 @@
           </w:p>
           <w:p>
             <w:pPr>
+              <w:keepLines w:val="0"/>
+              <w:widowControl w:val="1"/>
               <w:numPr>
                 <w:ilvl w:val="0"/>
                 <w:numId w:val="3"/>
               </w:numPr>
-              <w:spacing w:after="0" w:before="240" w:line="259" w:lineRule="auto"/>
+              <w:spacing w:after="0" w:line="259" w:lineRule="auto"/>
               <w:ind w:left="720" w:right="0" w:hanging="360"/>
               <w:rPr>
                 <w:rFonts w:ascii="Calibri" w:cs="Calibri" w:eastAsia="Calibri" w:hAnsi="Calibri"/>
@@ -567,11 +571,221 @@
                 <w:szCs w:val="22"/>
                 <w:rtl w:val="0"/>
               </w:rPr>
-              <w:t xml:space="preserve">Diseñar una interfaz web orientada al comercio electrónico, priorizando la usabilidad. CMS Wordpress.</w:t>
-            </w:r>
-          </w:p>
-          <w:p>
-            <w:pPr>
+              <w:t xml:space="preserve">Diseñar una interfaz web orientada al comercio electrónico, priorizando la usabilidad mediante Bootstrap 5 para responsividad en dispositivos móviles, tablets y escritorio.</w:t>
+            </w:r>
+          </w:p>
+          <w:p>
+            <w:pPr>
+              <w:keepLines w:val="0"/>
+              <w:widowControl w:val="1"/>
+              <w:numPr>
+                <w:ilvl w:val="0"/>
+                <w:numId w:val="3"/>
+              </w:numPr>
+              <w:spacing w:after="0" w:line="259" w:lineRule="auto"/>
+              <w:ind w:left="720" w:right="0" w:hanging="360"/>
+              <w:rPr>
+                <w:rFonts w:ascii="Calibri" w:cs="Calibri" w:eastAsia="Calibri" w:hAnsi="Calibri"/>
+                <w:sz w:val="22"/>
+                <w:szCs w:val="22"/>
+              </w:rPr>
+            </w:pPr>
+            <w:r>
+              <w:rPr>
+                <w:rFonts w:ascii="Calibri" w:cs="Calibri" w:eastAsia="Calibri" w:hAnsi="Calibri"/>
+                <w:sz w:val="22"/>
+                <w:szCs w:val="22"/>
+                <w:rtl w:val="0"/>
+              </w:rPr>
+              <w:t xml:space="preserve">Construir un catálogo digital de productos con fotos almacenadas en DigitalOcean Spaces, precios actuales y stock actualizado en tiempo real.</w:t>
+            </w:r>
+          </w:p>
+          <w:p>
+            <w:pPr>
+              <w:keepLines w:val="0"/>
+              <w:widowControl w:val="1"/>
+              <w:numPr>
+                <w:ilvl w:val="0"/>
+                <w:numId w:val="3"/>
+              </w:numPr>
+              <w:spacing w:after="0" w:line="259" w:lineRule="auto"/>
+              <w:ind w:left="720" w:right="0" w:hanging="360"/>
+              <w:rPr>
+                <w:rFonts w:ascii="Calibri" w:cs="Calibri" w:eastAsia="Calibri" w:hAnsi="Calibri"/>
+                <w:sz w:val="22"/>
+                <w:szCs w:val="22"/>
+              </w:rPr>
+            </w:pPr>
+            <w:r>
+              <w:rPr>
+                <w:rFonts w:ascii="Calibri" w:cs="Calibri" w:eastAsia="Calibri" w:hAnsi="Calibri"/>
+                <w:sz w:val="22"/>
+                <w:szCs w:val="22"/>
+                <w:rtl w:val="0"/>
+              </w:rPr>
+              <w:t xml:space="preserve">Implementar gestión administrativa del stock, permitiendo migrar la planilla actual a la base de datos PostgreSQL 17 y modificar inventario por volúmenes.</w:t>
+            </w:r>
+          </w:p>
+          <w:p>
+            <w:pPr>
+              <w:keepLines w:val="0"/>
+              <w:widowControl w:val="1"/>
+              <w:numPr>
+                <w:ilvl w:val="0"/>
+                <w:numId w:val="3"/>
+              </w:numPr>
+              <w:spacing w:after="0" w:line="259" w:lineRule="auto"/>
+              <w:ind w:left="720" w:right="0" w:hanging="360"/>
+              <w:rPr>
+                <w:rFonts w:ascii="Calibri" w:cs="Calibri" w:eastAsia="Calibri" w:hAnsi="Calibri"/>
+                <w:sz w:val="22"/>
+                <w:szCs w:val="22"/>
+              </w:rPr>
+            </w:pPr>
+            <w:r>
+              <w:rPr>
+                <w:rFonts w:ascii="Calibri" w:cs="Calibri" w:eastAsia="Calibri" w:hAnsi="Calibri"/>
+                <w:sz w:val="22"/>
+                <w:szCs w:val="22"/>
+                <w:rtl w:val="0"/>
+              </w:rPr>
+              <w:t xml:space="preserve">Implementar una base de datos segura y escalable en PostgreSQL 17 para gestionar clientes, pedidos, despachos y métodos de pago.</w:t>
+            </w:r>
+          </w:p>
+          <w:p>
+            <w:pPr>
+              <w:keepLines w:val="0"/>
+              <w:widowControl w:val="1"/>
+              <w:numPr>
+                <w:ilvl w:val="0"/>
+                <w:numId w:val="3"/>
+              </w:numPr>
+              <w:spacing w:after="0" w:line="259" w:lineRule="auto"/>
+              <w:ind w:left="720" w:right="0" w:hanging="360"/>
+              <w:rPr>
+                <w:rFonts w:ascii="Calibri" w:cs="Calibri" w:eastAsia="Calibri" w:hAnsi="Calibri"/>
+                <w:sz w:val="22"/>
+                <w:szCs w:val="22"/>
+              </w:rPr>
+            </w:pPr>
+            <w:r>
+              <w:rPr>
+                <w:rFonts w:ascii="Calibri" w:cs="Calibri" w:eastAsia="Calibri" w:hAnsi="Calibri"/>
+                <w:sz w:val="22"/>
+                <w:szCs w:val="22"/>
+                <w:rtl w:val="0"/>
+              </w:rPr>
+              <w:t xml:space="preserve">Integrar pasarela de pago en línea segura mediante Transbank Webpay Plus para transacciones rápidas y seguras con tarjetas débito/crédito.</w:t>
+            </w:r>
+          </w:p>
+          <w:p>
+            <w:pPr>
+              <w:keepLines w:val="0"/>
+              <w:widowControl w:val="1"/>
+              <w:numPr>
+                <w:ilvl w:val="0"/>
+                <w:numId w:val="3"/>
+              </w:numPr>
+              <w:spacing w:after="0" w:line="259" w:lineRule="auto"/>
+              <w:ind w:left="720" w:right="0" w:hanging="360"/>
+              <w:rPr>
+                <w:rFonts w:ascii="Calibri" w:cs="Calibri" w:eastAsia="Calibri" w:hAnsi="Calibri"/>
+                <w:sz w:val="22"/>
+                <w:szCs w:val="22"/>
+              </w:rPr>
+            </w:pPr>
+            <w:r>
+              <w:rPr>
+                <w:rFonts w:ascii="Calibri" w:cs="Calibri" w:eastAsia="Calibri" w:hAnsi="Calibri"/>
+                <w:sz w:val="22"/>
+                <w:szCs w:val="22"/>
+                <w:rtl w:val="0"/>
+              </w:rPr>
+              <w:t xml:space="preserve">Incorporar notificaciones sobre estado de compras y despachos mediante servicio de email Brevo para mantener a los clientes informados.</w:t>
+            </w:r>
+          </w:p>
+          <w:p>
+            <w:pPr>
+              <w:keepLines w:val="0"/>
+              <w:widowControl w:val="1"/>
+              <w:numPr>
+                <w:ilvl w:val="0"/>
+                <w:numId w:val="3"/>
+              </w:numPr>
+              <w:spacing w:after="0" w:line="259" w:lineRule="auto"/>
+              <w:ind w:left="720" w:right="0" w:hanging="360"/>
+              <w:rPr>
+                <w:rFonts w:ascii="Calibri" w:cs="Calibri" w:eastAsia="Calibri" w:hAnsi="Calibri"/>
+                <w:sz w:val="22"/>
+                <w:szCs w:val="22"/>
+              </w:rPr>
+            </w:pPr>
+            <w:r>
+              <w:rPr>
+                <w:rFonts w:ascii="Calibri" w:cs="Calibri" w:eastAsia="Calibri" w:hAnsi="Calibri"/>
+                <w:sz w:val="22"/>
+                <w:szCs w:val="22"/>
+                <w:rtl w:val="0"/>
+              </w:rPr>
+              <w:t xml:space="preserve">Generación automática de reportes de ventas mensuales que incluyan productos más vendidos, rentabilidad por producto y análisis de tendencias.</w:t>
+            </w:r>
+          </w:p>
+          <w:p>
+            <w:pPr>
+              <w:keepLines w:val="0"/>
+              <w:widowControl w:val="1"/>
+              <w:numPr>
+                <w:ilvl w:val="0"/>
+                <w:numId w:val="3"/>
+              </w:numPr>
+              <w:spacing w:after="0" w:line="259" w:lineRule="auto"/>
+              <w:ind w:left="720" w:right="0" w:hanging="360"/>
+              <w:rPr>
+                <w:rFonts w:ascii="Calibri" w:cs="Calibri" w:eastAsia="Calibri" w:hAnsi="Calibri"/>
+                <w:sz w:val="22"/>
+                <w:szCs w:val="22"/>
+              </w:rPr>
+            </w:pPr>
+            <w:r>
+              <w:rPr>
+                <w:rFonts w:ascii="Calibri" w:cs="Calibri" w:eastAsia="Calibri" w:hAnsi="Calibri"/>
+                <w:sz w:val="22"/>
+                <w:szCs w:val="22"/>
+                <w:rtl w:val="0"/>
+              </w:rPr>
+              <w:t xml:space="preserve">Implementar sistema de autenticación para clientes con historial de compras, perfiles personalizados y preferencias guardadas.</w:t>
+            </w:r>
+          </w:p>
+          <w:p>
+            <w:pPr>
+              <w:keepLines w:val="0"/>
+              <w:widowControl w:val="1"/>
+              <w:numPr>
+                <w:ilvl w:val="0"/>
+                <w:numId w:val="3"/>
+              </w:numPr>
+              <w:spacing w:after="0" w:line="259" w:lineRule="auto"/>
+              <w:ind w:left="720" w:right="0" w:hanging="360"/>
+              <w:rPr>
+                <w:rFonts w:ascii="Calibri" w:cs="Calibri" w:eastAsia="Calibri" w:hAnsi="Calibri"/>
+                <w:sz w:val="22"/>
+                <w:szCs w:val="22"/>
+              </w:rPr>
+            </w:pPr>
+            <w:r>
+              <w:rPr>
+                <w:rFonts w:ascii="Calibri" w:cs="Calibri" w:eastAsia="Calibri" w:hAnsi="Calibri"/>
+                <w:sz w:val="22"/>
+                <w:szCs w:val="22"/>
+                <w:rtl w:val="0"/>
+              </w:rPr>
+              <w:t xml:space="preserve">Ejecutar pruebas de funcionalidad, rendimiento y seguridad antes de la puesta en producción, incluyendo validación de integraciones.</w:t>
+            </w:r>
+          </w:p>
+          <w:p>
+            <w:pPr>
+              <w:keepLines w:val="0"/>
+              <w:widowControl w:val="1"/>
               <w:numPr>
                 <w:ilvl w:val="0"/>
                 <w:numId w:val="3"/>
@@ -582,30 +796,6 @@
                 <w:rFonts w:ascii="Calibri" w:cs="Calibri" w:eastAsia="Calibri" w:hAnsi="Calibri"/>
                 <w:sz w:val="22"/>
                 <w:szCs w:val="22"/>
-              </w:rPr>
-            </w:pPr>
-            <w:r>
-              <w:rPr>
-                <w:rFonts w:ascii="Calibri" w:cs="Calibri" w:eastAsia="Calibri" w:hAnsi="Calibri"/>
-                <w:sz w:val="22"/>
-                <w:szCs w:val="22"/>
-                <w:rtl w:val="0"/>
-              </w:rPr>
-              <w:t xml:space="preserve">Construir un catálogo digital de productos con fotos, precios y stock actualizado en tiempo real.</w:t>
-            </w:r>
-          </w:p>
-          <w:p>
-            <w:pPr>
-              <w:numPr>
-                <w:ilvl w:val="0"/>
-                <w:numId w:val="3"/>
-              </w:numPr>
-              <w:spacing w:after="0" w:before="0" w:line="259" w:lineRule="auto"/>
-              <w:ind w:left="720" w:right="0" w:hanging="360"/>
-              <w:rPr>
-                <w:rFonts w:ascii="Calibri" w:cs="Calibri" w:eastAsia="Calibri" w:hAnsi="Calibri"/>
-                <w:sz w:val="22"/>
-                <w:szCs w:val="22"/>
                 <w:u w:val="none"/>
               </w:rPr>
             </w:pPr>
@@ -616,177 +806,7 @@
                 <w:szCs w:val="22"/>
                 <w:rtl w:val="0"/>
               </w:rPr>
-              <w:t xml:space="preserve">Vista de administración del stock (Migrar la planilla a la BD y modificar el stock por volúmenes, etc)</w:t>
-            </w:r>
-          </w:p>
-          <w:p>
-            <w:pPr>
-              <w:numPr>
-                <w:ilvl w:val="0"/>
-                <w:numId w:val="3"/>
-              </w:numPr>
-              <w:spacing w:after="0" w:before="0" w:line="259" w:lineRule="auto"/>
-              <w:ind w:left="720" w:right="0" w:hanging="360"/>
-              <w:rPr>
-                <w:rFonts w:ascii="Calibri" w:cs="Calibri" w:eastAsia="Calibri" w:hAnsi="Calibri"/>
-                <w:sz w:val="22"/>
-                <w:szCs w:val="22"/>
-              </w:rPr>
-            </w:pPr>
-            <w:r>
-              <w:rPr>
-                <w:rFonts w:ascii="Calibri" w:cs="Calibri" w:eastAsia="Calibri" w:hAnsi="Calibri"/>
-                <w:sz w:val="22"/>
-                <w:szCs w:val="22"/>
-                <w:rtl w:val="0"/>
-              </w:rPr>
-              <w:t xml:space="preserve">Implementar una base de datos segura y escalable para clientes, pedidos y despachos.</w:t>
-            </w:r>
-          </w:p>
-          <w:p>
-            <w:pPr>
-              <w:numPr>
-                <w:ilvl w:val="0"/>
-                <w:numId w:val="3"/>
-              </w:numPr>
-              <w:spacing w:after="0" w:before="0" w:line="259" w:lineRule="auto"/>
-              <w:ind w:left="720" w:right="0" w:hanging="360"/>
-              <w:rPr>
-                <w:rFonts w:ascii="Calibri" w:cs="Calibri" w:eastAsia="Calibri" w:hAnsi="Calibri"/>
-                <w:sz w:val="22"/>
-                <w:szCs w:val="22"/>
-              </w:rPr>
-            </w:pPr>
-            <w:r>
-              <w:rPr>
-                <w:rFonts w:ascii="Calibri" w:cs="Calibri" w:eastAsia="Calibri" w:hAnsi="Calibri"/>
-                <w:sz w:val="22"/>
-                <w:szCs w:val="22"/>
-                <w:rtl w:val="0"/>
-              </w:rPr>
-              <w:t xml:space="preserve">Integrar una pasarela de pago en línea para transacciones rápidas y seguras.</w:t>
-            </w:r>
-          </w:p>
-          <w:p>
-            <w:pPr>
-              <w:numPr>
-                <w:ilvl w:val="0"/>
-                <w:numId w:val="3"/>
-              </w:numPr>
-              <w:spacing w:after="0" w:before="0" w:line="259" w:lineRule="auto"/>
-              <w:ind w:left="720" w:right="0" w:hanging="360"/>
-              <w:rPr>
-                <w:rFonts w:ascii="Calibri" w:cs="Calibri" w:eastAsia="Calibri" w:hAnsi="Calibri"/>
-                <w:sz w:val="22"/>
-                <w:szCs w:val="22"/>
-              </w:rPr>
-            </w:pPr>
-            <w:r>
-              <w:rPr>
-                <w:rFonts w:ascii="Calibri" w:cs="Calibri" w:eastAsia="Calibri" w:hAnsi="Calibri"/>
-                <w:sz w:val="22"/>
-                <w:szCs w:val="22"/>
-                <w:rtl w:val="0"/>
-              </w:rPr>
-              <w:t xml:space="preserve">Incorporar notificaciones sobre estado de compras y despachos.</w:t>
-            </w:r>
-          </w:p>
-          <w:p>
-            <w:pPr>
-              <w:numPr>
-                <w:ilvl w:val="0"/>
-                <w:numId w:val="3"/>
-              </w:numPr>
-              <w:spacing w:after="0" w:before="0" w:line="259" w:lineRule="auto"/>
-              <w:ind w:left="720" w:right="0" w:hanging="360"/>
-              <w:rPr>
-                <w:rFonts w:ascii="Calibri" w:cs="Calibri" w:eastAsia="Calibri" w:hAnsi="Calibri"/>
-                <w:sz w:val="22"/>
-                <w:szCs w:val="22"/>
-                <w:u w:val="none"/>
-              </w:rPr>
-            </w:pPr>
-            <w:r>
-              <w:rPr>
-                <w:rFonts w:ascii="Calibri" w:cs="Calibri" w:eastAsia="Calibri" w:hAnsi="Calibri"/>
-                <w:sz w:val="22"/>
-                <w:szCs w:val="22"/>
-                <w:rtl w:val="0"/>
-              </w:rPr>
-              <w:t xml:space="preserve">Generación de reportes de las ventas mensuales del dueño del negocio (ej: ventas mensuales productos más vendidos y rentabilidad por producto).</w:t>
-            </w:r>
-          </w:p>
-          <w:p>
-            <w:pPr>
-              <w:numPr>
-                <w:ilvl w:val="0"/>
-                <w:numId w:val="3"/>
-              </w:numPr>
-              <w:spacing w:after="0" w:before="0" w:line="259" w:lineRule="auto"/>
-              <w:ind w:left="720" w:right="0" w:hanging="360"/>
-              <w:rPr>
-                <w:rFonts w:ascii="Calibri" w:cs="Calibri" w:eastAsia="Calibri" w:hAnsi="Calibri"/>
-                <w:sz w:val="22"/>
-                <w:szCs w:val="22"/>
-              </w:rPr>
-            </w:pPr>
-            <w:r>
-              <w:rPr>
-                <w:rFonts w:ascii="Calibri" w:cs="Calibri" w:eastAsia="Calibri" w:hAnsi="Calibri"/>
-                <w:sz w:val="22"/>
-                <w:szCs w:val="22"/>
-                <w:rtl w:val="0"/>
-              </w:rPr>
-              <w:t xml:space="preserve">Implementar sistema de autenticación para clientes con historial de compras y preferencias.</w:t>
-            </w:r>
-          </w:p>
-          <w:p>
-            <w:pPr>
-              <w:numPr>
-                <w:ilvl w:val="0"/>
-                <w:numId w:val="3"/>
-              </w:numPr>
-              <w:spacing w:after="240" w:before="0" w:line="259" w:lineRule="auto"/>
-              <w:ind w:left="720" w:right="0" w:hanging="360"/>
-              <w:rPr>
-                <w:rFonts w:ascii="Calibri" w:cs="Calibri" w:eastAsia="Calibri" w:hAnsi="Calibri"/>
-                <w:sz w:val="22"/>
-                <w:szCs w:val="22"/>
-              </w:rPr>
-            </w:pPr>
-            <w:r>
-              <w:rPr>
-                <w:rFonts w:ascii="Calibri" w:cs="Calibri" w:eastAsia="Calibri" w:hAnsi="Calibri"/>
-                <w:sz w:val="22"/>
-                <w:szCs w:val="22"/>
-                <w:rtl w:val="0"/>
-              </w:rPr>
-              <w:t xml:space="preserve">Ejecutar pruebas de funcionalidad, rendimiento y seguridad antes de la puesta en producción.</w:t>
-            </w:r>
-          </w:p>
-          <w:p>
-            <w:pPr>
-              <w:numPr>
-                <w:ilvl w:val="0"/>
-                <w:numId w:val="3"/>
-              </w:numPr>
-              <w:spacing w:after="240" w:before="0" w:line="259" w:lineRule="auto"/>
-              <w:ind w:left="720" w:right="0" w:hanging="360"/>
-              <w:rPr>
-                <w:rFonts w:ascii="Calibri" w:cs="Calibri" w:eastAsia="Calibri" w:hAnsi="Calibri"/>
-                <w:sz w:val="22"/>
-                <w:szCs w:val="22"/>
-                <w:u w:val="none"/>
-              </w:rPr>
-            </w:pPr>
-            <w:r>
-              <w:rPr>
-                <w:rFonts w:ascii="Calibri" w:cs="Calibri" w:eastAsia="Calibri" w:hAnsi="Calibri"/>
-                <w:sz w:val="22"/>
-                <w:szCs w:val="22"/>
-                <w:rtl w:val="0"/>
-              </w:rPr>
-              <w:t xml:space="preserve">Desarrollar sección de noticias y campañas promocionales.</w:t>
+              <w:t xml:space="preserve">Desarrollar panel administrativo profesional con gestión CRUD de productos, usuarios, pedidos, stock y cálculo de costos de envío mediante MultiCourier API.</w:t>
             </w:r>
           </w:p>
         </w:tc>
@@ -845,6 +865,7 @@
           <w:p>
             <w:pPr>
               <w:pStyle w:val="Heading1"/>
+              <w:ind w:firstLine="0"/>
               <w:rPr/>
             </w:pPr>
             <w:bookmarkStart w:colFirst="0" w:colLast="0" w:name="_heading=h.j27qd4plnb9b" w:id="3"/>
@@ -854,25 +875,6 @@
                 <w:rtl w:val="0"/>
               </w:rPr>
               <w:t xml:space="preserve">Alcance del Proyecto</w:t>
-            </w:r>
-          </w:p>
-          <w:p>
-            <w:pPr>
-              <w:ind w:left="0"/>
-              <w:rPr>
-                <w:rFonts w:ascii="Calibri" w:cs="Calibri" w:eastAsia="Calibri" w:hAnsi="Calibri"/>
-                <w:sz w:val="22"/>
-                <w:szCs w:val="22"/>
-              </w:rPr>
-            </w:pPr>
-            <w:r>
-              <w:rPr>
-                <w:rFonts w:ascii="Calibri" w:cs="Calibri" w:eastAsia="Calibri" w:hAnsi="Calibri"/>
-                <w:sz w:val="22"/>
-                <w:szCs w:val="22"/>
-                <w:rtl w:val="0"/>
-              </w:rPr>
-              <w:t xml:space="preserve">Entregables</w:t>
             </w:r>
           </w:p>
           <w:p>
@@ -886,17 +888,16 @@
                 <w:rFonts w:ascii="Calibri" w:cs="Calibri" w:eastAsia="Calibri" w:hAnsi="Calibri"/>
                 <w:sz w:val="22"/>
                 <w:szCs w:val="22"/>
-                <w:u w:val="none"/>
-              </w:rPr>
-            </w:pPr>
-            <w:r>
-              <w:rPr>
-                <w:rFonts w:ascii="Calibri" w:cs="Calibri" w:eastAsia="Calibri" w:hAnsi="Calibri"/>
-                <w:sz w:val="22"/>
-                <w:szCs w:val="22"/>
-                <w:rtl w:val="0"/>
-              </w:rPr>
-              <w:t xml:space="preserve">Plataforma web e-commerce funcional, desarrollada con Django y MySQL.</w:t>
+              </w:rPr>
+            </w:pPr>
+            <w:r>
+              <w:rPr>
+                <w:rFonts w:ascii="Calibri" w:cs="Calibri" w:eastAsia="Calibri" w:hAnsi="Calibri"/>
+                <w:sz w:val="22"/>
+                <w:szCs w:val="22"/>
+                <w:rtl w:val="0"/>
+              </w:rPr>
+              <w:t xml:space="preserve">Desarrollo e implementación de una plataforma e-commerce completa para Cordillera Pets.</w:t>
             </w:r>
           </w:p>
           <w:p>
@@ -910,17 +911,16 @@
                 <w:rFonts w:ascii="Calibri" w:cs="Calibri" w:eastAsia="Calibri" w:hAnsi="Calibri"/>
                 <w:sz w:val="22"/>
                 <w:szCs w:val="22"/>
-                <w:u w:val="none"/>
-              </w:rPr>
-            </w:pPr>
-            <w:r>
-              <w:rPr>
-                <w:rFonts w:ascii="Calibri" w:cs="Calibri" w:eastAsia="Calibri" w:hAnsi="Calibri"/>
-                <w:sz w:val="22"/>
-                <w:szCs w:val="22"/>
-                <w:rtl w:val="0"/>
-              </w:rPr>
-              <w:t xml:space="preserve">Catálogo digital de productos con imágenes, precios y stock actualizado.</w:t>
+              </w:rPr>
+            </w:pPr>
+            <w:r>
+              <w:rPr>
+                <w:rFonts w:ascii="Calibri" w:cs="Calibri" w:eastAsia="Calibri" w:hAnsi="Calibri"/>
+                <w:sz w:val="22"/>
+                <w:szCs w:val="22"/>
+                <w:rtl w:val="0"/>
+              </w:rPr>
+              <w:t xml:space="preserve">Incluye diseño UI/UX, desarrollo frontend y backend, integración de pasarela de pago y panel administrativo.</w:t>
             </w:r>
           </w:p>
           <w:p>
@@ -934,17 +934,16 @@
                 <w:rFonts w:ascii="Calibri" w:cs="Calibri" w:eastAsia="Calibri" w:hAnsi="Calibri"/>
                 <w:sz w:val="22"/>
                 <w:szCs w:val="22"/>
-                <w:u w:val="none"/>
-              </w:rPr>
-            </w:pPr>
-            <w:r>
-              <w:rPr>
-                <w:rFonts w:ascii="Calibri" w:cs="Calibri" w:eastAsia="Calibri" w:hAnsi="Calibri"/>
-                <w:sz w:val="22"/>
-                <w:szCs w:val="22"/>
-                <w:rtl w:val="0"/>
-              </w:rPr>
-              <w:t xml:space="preserve">Carrito de compras y proceso de checkout seguro.</w:t>
+              </w:rPr>
+            </w:pPr>
+            <w:r>
+              <w:rPr>
+                <w:rFonts w:ascii="Calibri" w:cs="Calibri" w:eastAsia="Calibri" w:hAnsi="Calibri"/>
+                <w:sz w:val="22"/>
+                <w:szCs w:val="22"/>
+                <w:rtl w:val="0"/>
+              </w:rPr>
+              <w:t xml:space="preserve">El proyecto contempla pruebas funcionales, de integración y de usabilidad, además del despliegue en un entorno cloud.</w:t>
             </w:r>
           </w:p>
           <w:p>
@@ -958,17 +957,16 @@
                 <w:rFonts w:ascii="Calibri" w:cs="Calibri" w:eastAsia="Calibri" w:hAnsi="Calibri"/>
                 <w:sz w:val="22"/>
                 <w:szCs w:val="22"/>
-                <w:u w:val="none"/>
-              </w:rPr>
-            </w:pPr>
-            <w:r>
-              <w:rPr>
-                <w:rFonts w:ascii="Calibri" w:cs="Calibri" w:eastAsia="Calibri" w:hAnsi="Calibri"/>
-                <w:sz w:val="22"/>
-                <w:szCs w:val="22"/>
-                <w:rtl w:val="0"/>
-              </w:rPr>
-              <w:t xml:space="preserve">Sección de noticias y promociones.</w:t>
+              </w:rPr>
+            </w:pPr>
+            <w:r>
+              <w:rPr>
+                <w:rFonts w:ascii="Calibri" w:cs="Calibri" w:eastAsia="Calibri" w:hAnsi="Calibri"/>
+                <w:sz w:val="22"/>
+                <w:szCs w:val="22"/>
+                <w:rtl w:val="0"/>
+              </w:rPr>
+              <w:t xml:space="preserve">La pyme Cordillera Pets asumirá los costos asociados al hosting, servicios cloud y puesta en producción.</w:t>
             </w:r>
           </w:p>
           <w:p>
@@ -982,181 +980,36 @@
                 <w:rFonts w:ascii="Calibri" w:cs="Calibri" w:eastAsia="Calibri" w:hAnsi="Calibri"/>
                 <w:sz w:val="22"/>
                 <w:szCs w:val="22"/>
-                <w:u w:val="none"/>
-              </w:rPr>
-            </w:pPr>
-            <w:r>
-              <w:rPr>
-                <w:rFonts w:ascii="Calibri" w:cs="Calibri" w:eastAsia="Calibri" w:hAnsi="Calibri"/>
-                <w:sz w:val="22"/>
-                <w:szCs w:val="22"/>
-                <w:rtl w:val="0"/>
-              </w:rPr>
-              <w:t xml:space="preserve">Integración con pasarela de pagos (Transbank/Webpay, tarjetas débito/crédito).</w:t>
-            </w:r>
-          </w:p>
-          <w:p>
-            <w:pPr>
-              <w:numPr>
-                <w:ilvl w:val="0"/>
-                <w:numId w:val="2"/>
-              </w:numPr>
-              <w:ind w:left="720" w:hanging="360"/>
-              <w:rPr>
-                <w:rFonts w:ascii="Calibri" w:cs="Calibri" w:eastAsia="Calibri" w:hAnsi="Calibri"/>
-                <w:sz w:val="22"/>
-                <w:szCs w:val="22"/>
-                <w:u w:val="none"/>
-              </w:rPr>
-            </w:pPr>
-            <w:r>
-              <w:rPr>
-                <w:rFonts w:ascii="Calibri" w:cs="Calibri" w:eastAsia="Calibri" w:hAnsi="Calibri"/>
-                <w:sz w:val="22"/>
-                <w:szCs w:val="22"/>
-                <w:rtl w:val="0"/>
-              </w:rPr>
-              <w:t xml:space="preserve">Gestión de clientes: registro, autenticación, perfiles e historial de compras.</w:t>
-            </w:r>
-          </w:p>
-          <w:p>
-            <w:pPr>
-              <w:numPr>
-                <w:ilvl w:val="0"/>
-                <w:numId w:val="2"/>
-              </w:numPr>
-              <w:ind w:left="720" w:hanging="360"/>
-              <w:rPr>
-                <w:rFonts w:ascii="Calibri" w:cs="Calibri" w:eastAsia="Calibri" w:hAnsi="Calibri"/>
-                <w:sz w:val="22"/>
-                <w:szCs w:val="22"/>
-                <w:u w:val="none"/>
-              </w:rPr>
-            </w:pPr>
-            <w:r>
-              <w:rPr>
-                <w:rFonts w:ascii="Calibri" w:cs="Calibri" w:eastAsia="Calibri" w:hAnsi="Calibri"/>
-                <w:sz w:val="22"/>
-                <w:szCs w:val="22"/>
-                <w:rtl w:val="0"/>
-              </w:rPr>
-              <w:t xml:space="preserve">Gestión de pedidos y envíos: estados de compra, notificaciones automáticas por correo, configuración de costos de despacho.</w:t>
-            </w:r>
-          </w:p>
-          <w:p>
-            <w:pPr>
-              <w:numPr>
-                <w:ilvl w:val="0"/>
-                <w:numId w:val="2"/>
-              </w:numPr>
-              <w:ind w:left="720" w:hanging="360"/>
-              <w:rPr>
-                <w:rFonts w:ascii="Calibri" w:cs="Calibri" w:eastAsia="Calibri" w:hAnsi="Calibri"/>
-                <w:sz w:val="22"/>
-                <w:szCs w:val="22"/>
-                <w:u w:val="none"/>
-              </w:rPr>
-            </w:pPr>
-            <w:r>
-              <w:rPr>
-                <w:rFonts w:ascii="Calibri" w:cs="Calibri" w:eastAsia="Calibri" w:hAnsi="Calibri"/>
-                <w:sz w:val="22"/>
-                <w:szCs w:val="22"/>
-                <w:rtl w:val="0"/>
-              </w:rPr>
-              <w:t xml:space="preserve">Panel administrativo para la gestión de productos, usuarios, pedidos y stock.</w:t>
-            </w:r>
-          </w:p>
-          <w:p>
-            <w:pPr>
-              <w:numPr>
-                <w:ilvl w:val="0"/>
-                <w:numId w:val="2"/>
-              </w:numPr>
-              <w:ind w:left="720" w:hanging="360"/>
-              <w:rPr>
-                <w:rFonts w:ascii="Calibri" w:cs="Calibri" w:eastAsia="Calibri" w:hAnsi="Calibri"/>
-                <w:sz w:val="22"/>
-                <w:szCs w:val="22"/>
-                <w:u w:val="none"/>
-              </w:rPr>
-            </w:pPr>
-            <w:r>
-              <w:rPr>
-                <w:rFonts w:ascii="Calibri" w:cs="Calibri" w:eastAsia="Calibri" w:hAnsi="Calibri"/>
-                <w:sz w:val="22"/>
-                <w:szCs w:val="22"/>
-                <w:rtl w:val="0"/>
-              </w:rPr>
-              <w:t xml:space="preserve">Reportes de ventas mensuales.</w:t>
-            </w:r>
-          </w:p>
-          <w:p>
-            <w:pPr>
-              <w:numPr>
-                <w:ilvl w:val="0"/>
-                <w:numId w:val="2"/>
-              </w:numPr>
-              <w:ind w:left="720" w:hanging="360"/>
-              <w:rPr>
-                <w:rFonts w:ascii="Calibri" w:cs="Calibri" w:eastAsia="Calibri" w:hAnsi="Calibri"/>
-                <w:sz w:val="22"/>
-                <w:szCs w:val="22"/>
-                <w:u w:val="none"/>
-              </w:rPr>
-            </w:pPr>
-            <w:r>
-              <w:rPr>
-                <w:rFonts w:ascii="Calibri" w:cs="Calibri" w:eastAsia="Calibri" w:hAnsi="Calibri"/>
-                <w:sz w:val="22"/>
-                <w:szCs w:val="22"/>
-                <w:rtl w:val="0"/>
-              </w:rPr>
-              <w:t xml:space="preserve">Diseño responsive accesible desde computador, tablet y celular.</w:t>
-            </w:r>
-          </w:p>
-          <w:p>
-            <w:pPr>
-              <w:numPr>
-                <w:ilvl w:val="0"/>
-                <w:numId w:val="2"/>
-              </w:numPr>
-              <w:ind w:left="720" w:hanging="360"/>
-              <w:rPr>
-                <w:rFonts w:ascii="Calibri" w:cs="Calibri" w:eastAsia="Calibri" w:hAnsi="Calibri"/>
-                <w:sz w:val="22"/>
-                <w:szCs w:val="22"/>
-                <w:u w:val="none"/>
-              </w:rPr>
-            </w:pPr>
-            <w:r>
-              <w:rPr>
-                <w:rFonts w:ascii="Calibri" w:cs="Calibri" w:eastAsia="Calibri" w:hAnsi="Calibri"/>
-                <w:sz w:val="22"/>
-                <w:szCs w:val="22"/>
-                <w:rtl w:val="0"/>
-              </w:rPr>
-              <w:t xml:space="preserve">Políticas de seguridad y privacidad.</w:t>
-            </w:r>
-          </w:p>
-          <w:p>
-            <w:pPr>
-              <w:ind w:left="0"/>
-              <w:rPr>
-                <w:rFonts w:ascii="Calibri" w:cs="Calibri" w:eastAsia="Calibri" w:hAnsi="Calibri"/>
-                <w:sz w:val="22"/>
-                <w:szCs w:val="22"/>
-              </w:rPr>
-            </w:pPr>
-            <w:r>
-              <w:rPr>
-                <w:rtl w:val="0"/>
-              </w:rPr>
-            </w:r>
-          </w:p>
-          <w:p>
-            <w:pPr>
-              <w:ind w:left="0"/>
+              </w:rPr>
+            </w:pPr>
+            <w:r>
+              <w:rPr>
+                <w:rFonts w:ascii="Calibri" w:cs="Calibri" w:eastAsia="Calibri" w:hAnsi="Calibri"/>
+                <w:sz w:val="22"/>
+                <w:szCs w:val="22"/>
+                <w:rtl w:val="0"/>
+              </w:rPr>
+              <w:t xml:space="preserve">Se capacitará al dueño y al personal en el uso del panel administrativo y en la gestión del e-commerce.</w:t>
+            </w:r>
+          </w:p>
+          <w:p>
+            <w:pPr>
+              <w:ind w:left="0" w:firstLine="0"/>
+              <w:rPr>
+                <w:rFonts w:ascii="Calibri" w:cs="Calibri" w:eastAsia="Calibri" w:hAnsi="Calibri"/>
+                <w:sz w:val="22"/>
+                <w:szCs w:val="22"/>
+              </w:rPr>
+            </w:pPr>
+            <w:r>
+              <w:rPr>
+                <w:rtl w:val="0"/>
+              </w:rPr>
+            </w:r>
+          </w:p>
+          <w:p>
+            <w:pPr>
+              <w:ind w:left="0" w:firstLine="0"/>
               <w:rPr>
                 <w:rFonts w:ascii="Calibri" w:cs="Calibri" w:eastAsia="Calibri" w:hAnsi="Calibri"/>
                 <w:sz w:val="22"/>
@@ -1171,6 +1024,21 @@
                 <w:rtl w:val="0"/>
               </w:rPr>
               <w:t xml:space="preserve">Recursos</w:t>
+            </w:r>
+          </w:p>
+          <w:p>
+            <w:pPr>
+              <w:ind w:left="0" w:firstLine="0"/>
+              <w:rPr>
+                <w:rFonts w:ascii="Calibri" w:cs="Calibri" w:eastAsia="Calibri" w:hAnsi="Calibri"/>
+                <w:sz w:val="22"/>
+                <w:szCs w:val="22"/>
+              </w:rPr>
+            </w:pPr>
+            <w:r>
+              <w:rPr>
+                <w:rtl w:val="0"/>
+              </w:rPr>
             </w:r>
           </w:p>
           <w:p>
@@ -1184,17 +1052,16 @@
                 <w:rFonts w:ascii="Calibri" w:cs="Calibri" w:eastAsia="Calibri" w:hAnsi="Calibri"/>
                 <w:sz w:val="22"/>
                 <w:szCs w:val="22"/>
-                <w:u w:val="none"/>
-              </w:rPr>
-            </w:pPr>
-            <w:r>
-              <w:rPr>
-                <w:rFonts w:ascii="Calibri" w:cs="Calibri" w:eastAsia="Calibri" w:hAnsi="Calibri"/>
-                <w:sz w:val="22"/>
-                <w:szCs w:val="22"/>
-                <w:rtl w:val="0"/>
-              </w:rPr>
-              <w:t xml:space="preserve">Microsoft Azure</w:t>
+              </w:rPr>
+            </w:pPr>
+            <w:r>
+              <w:rPr>
+                <w:rFonts w:ascii="Calibri" w:cs="Calibri" w:eastAsia="Calibri" w:hAnsi="Calibri"/>
+                <w:sz w:val="22"/>
+                <w:szCs w:val="22"/>
+                <w:rtl w:val="0"/>
+              </w:rPr>
+              <w:t xml:space="preserve">Cloud Computing: DigitalOcean App Platform</w:t>
             </w:r>
           </w:p>
           <w:p>
@@ -1208,17 +1075,16 @@
                 <w:rFonts w:ascii="Calibri" w:cs="Calibri" w:eastAsia="Calibri" w:hAnsi="Calibri"/>
                 <w:sz w:val="22"/>
                 <w:szCs w:val="22"/>
-                <w:u w:val="none"/>
-              </w:rPr>
-            </w:pPr>
-            <w:r>
-              <w:rPr>
-                <w:rFonts w:ascii="Calibri" w:cs="Calibri" w:eastAsia="Calibri" w:hAnsi="Calibri"/>
-                <w:sz w:val="22"/>
-                <w:szCs w:val="22"/>
-                <w:rtl w:val="0"/>
-              </w:rPr>
-              <w:t xml:space="preserve">Vercel</w:t>
+              </w:rPr>
+            </w:pPr>
+            <w:r>
+              <w:rPr>
+                <w:rFonts w:ascii="Calibri" w:cs="Calibri" w:eastAsia="Calibri" w:hAnsi="Calibri"/>
+                <w:sz w:val="22"/>
+                <w:szCs w:val="22"/>
+                <w:rtl w:val="0"/>
+              </w:rPr>
+              <w:t xml:space="preserve">Pasarela de Pago: Transbank Webpay Plus (SDK v6.1.0)</w:t>
             </w:r>
           </w:p>
           <w:p>
@@ -1232,17 +1098,16 @@
                 <w:rFonts w:ascii="Calibri" w:cs="Calibri" w:eastAsia="Calibri" w:hAnsi="Calibri"/>
                 <w:sz w:val="22"/>
                 <w:szCs w:val="22"/>
-                <w:u w:val="none"/>
-              </w:rPr>
-            </w:pPr>
-            <w:r>
-              <w:rPr>
-                <w:rFonts w:ascii="Calibri" w:cs="Calibri" w:eastAsia="Calibri" w:hAnsi="Calibri"/>
-                <w:sz w:val="22"/>
-                <w:szCs w:val="22"/>
-                <w:rtl w:val="0"/>
-              </w:rPr>
-              <w:t xml:space="preserve">API Transbank/Webpay.</w:t>
+              </w:rPr>
+            </w:pPr>
+            <w:r>
+              <w:rPr>
+                <w:rFonts w:ascii="Calibri" w:cs="Calibri" w:eastAsia="Calibri" w:hAnsi="Calibri"/>
+                <w:sz w:val="22"/>
+                <w:szCs w:val="22"/>
+                <w:rtl w:val="0"/>
+              </w:rPr>
+              <w:t xml:space="preserve">Framework Backend: Django 5.2</w:t>
             </w:r>
           </w:p>
           <w:p>
@@ -1256,17 +1121,16 @@
                 <w:rFonts w:ascii="Calibri" w:cs="Calibri" w:eastAsia="Calibri" w:hAnsi="Calibri"/>
                 <w:sz w:val="22"/>
                 <w:szCs w:val="22"/>
-                <w:u w:val="none"/>
-              </w:rPr>
-            </w:pPr>
-            <w:r>
-              <w:rPr>
-                <w:rFonts w:ascii="Calibri" w:cs="Calibri" w:eastAsia="Calibri" w:hAnsi="Calibri"/>
-                <w:sz w:val="22"/>
-                <w:szCs w:val="22"/>
-                <w:rtl w:val="0"/>
-              </w:rPr>
-              <w:t xml:space="preserve">Framework Django</w:t>
+              </w:rPr>
+            </w:pPr>
+            <w:r>
+              <w:rPr>
+                <w:rFonts w:ascii="Calibri" w:cs="Calibri" w:eastAsia="Calibri" w:hAnsi="Calibri"/>
+                <w:sz w:val="22"/>
+                <w:szCs w:val="22"/>
+                <w:rtl w:val="0"/>
+              </w:rPr>
+              <w:t xml:space="preserve">Base de Datos: PostgreSQL 17</w:t>
             </w:r>
           </w:p>
           <w:p>
@@ -1280,474 +1144,163 @@
                 <w:rFonts w:ascii="Calibri" w:cs="Calibri" w:eastAsia="Calibri" w:hAnsi="Calibri"/>
                 <w:sz w:val="22"/>
                 <w:szCs w:val="22"/>
-                <w:u w:val="none"/>
-              </w:rPr>
-            </w:pPr>
-            <w:r>
-              <w:rPr>
-                <w:rFonts w:ascii="Calibri" w:cs="Calibri" w:eastAsia="Calibri" w:hAnsi="Calibri"/>
-                <w:sz w:val="22"/>
-                <w:szCs w:val="22"/>
-                <w:rtl w:val="0"/>
-              </w:rPr>
-              <w:t xml:space="preserve">Base de datos MySQL</w:t>
-            </w:r>
-          </w:p>
-          <w:p>
-            <w:pPr>
-              <w:ind w:left="0"/>
-              <w:rPr>
-                <w:rFonts w:ascii="Calibri" w:cs="Calibri" w:eastAsia="Calibri" w:hAnsi="Calibri"/>
-                <w:sz w:val="22"/>
-                <w:szCs w:val="22"/>
-              </w:rPr>
-            </w:pPr>
-            <w:r>
-              <w:rPr>
-                <w:rtl w:val="0"/>
-              </w:rPr>
-            </w:r>
-          </w:p>
-          <w:p>
-            <w:pPr>
-              <w:ind w:left="0"/>
-              <w:rPr>
-                <w:rFonts w:ascii="Calibri" w:cs="Calibri" w:eastAsia="Calibri" w:hAnsi="Calibri"/>
-                <w:sz w:val="22"/>
-                <w:szCs w:val="22"/>
-              </w:rPr>
-            </w:pPr>
-            <w:r>
-              <w:rPr>
-                <w:rFonts w:ascii="Calibri" w:cs="Calibri" w:eastAsia="Calibri" w:hAnsi="Calibri"/>
-                <w:sz w:val="22"/>
-                <w:szCs w:val="22"/>
-                <w:rtl w:val="0"/>
-              </w:rPr>
-              <w:t xml:space="preserve">Línea de Tiempo (17 semanas)</w:t>
-            </w:r>
-          </w:p>
-          <w:p>
-            <w:pPr>
-              <w:ind w:left="0"/>
-              <w:rPr>
-                <w:rFonts w:ascii="Calibri" w:cs="Calibri" w:eastAsia="Calibri" w:hAnsi="Calibri"/>
-                <w:sz w:val="22"/>
-                <w:szCs w:val="22"/>
-              </w:rPr>
-            </w:pPr>
-            <w:r>
-              <w:rPr>
-                <w:rtl w:val="0"/>
-              </w:rPr>
-            </w:r>
-          </w:p>
-          <w:p>
-            <w:pPr>
-              <w:spacing w:line="259" w:lineRule="auto"/>
-              <w:ind w:left="0" w:right="0" w:firstLine="0"/>
-              <w:rPr>
-                <w:rFonts w:ascii="Calibri" w:cs="Calibri" w:eastAsia="Calibri" w:hAnsi="Calibri"/>
-                <w:sz w:val="22"/>
-                <w:szCs w:val="22"/>
-              </w:rPr>
-            </w:pPr>
-            <w:r>
-              <w:rPr>
-                <w:rFonts w:ascii="Calibri" w:cs="Calibri" w:eastAsia="Calibri" w:hAnsi="Calibri"/>
-                <w:sz w:val="22"/>
-                <w:szCs w:val="22"/>
-                <w:rtl w:val="0"/>
-              </w:rPr>
-              <w:t xml:space="preserve">Metodología de trabajo: Ágil con desarrollo en sprints de 2 semanas, retroalimentación continua y validación con el cliente.</w:t>
-            </w:r>
-          </w:p>
-          <w:p>
-            <w:pPr>
-              <w:ind w:left="0"/>
-              <w:rPr>
-                <w:rFonts w:ascii="Calibri" w:cs="Calibri" w:eastAsia="Calibri" w:hAnsi="Calibri"/>
-                <w:sz w:val="22"/>
-                <w:szCs w:val="22"/>
-              </w:rPr>
-            </w:pPr>
-            <w:r>
-              <w:rPr>
-                <w:rtl w:val="0"/>
-              </w:rPr>
-            </w:r>
-          </w:p>
-          <w:p>
-            <w:pPr>
-              <w:ind w:left="0"/>
-              <w:rPr>
-                <w:rFonts w:ascii="Calibri" w:cs="Calibri" w:eastAsia="Calibri" w:hAnsi="Calibri"/>
-                <w:sz w:val="22"/>
-                <w:szCs w:val="22"/>
-              </w:rPr>
-            </w:pPr>
-            <w:r>
-              <w:rPr>
-                <w:rFonts w:ascii="Calibri" w:cs="Calibri" w:eastAsia="Calibri" w:hAnsi="Calibri"/>
-                <w:sz w:val="22"/>
-                <w:szCs w:val="22"/>
-                <w:rtl w:val="0"/>
-              </w:rPr>
-              <w:t xml:space="preserve">Costos</w:t>
-            </w:r>
-          </w:p>
-          <w:p>
-            <w:pPr>
-              <w:ind w:left="0"/>
-              <w:rPr>
-                <w:rFonts w:ascii="Calibri" w:cs="Calibri" w:eastAsia="Calibri" w:hAnsi="Calibri"/>
-                <w:sz w:val="22"/>
-                <w:szCs w:val="22"/>
-              </w:rPr>
-            </w:pPr>
-            <w:r>
-              <w:rPr>
-                <w:rFonts w:ascii="Calibri" w:cs="Calibri" w:eastAsia="Calibri" w:hAnsi="Calibri"/>
-                <w:sz w:val="22"/>
-                <w:szCs w:val="22"/>
-                <w:rtl w:val="0"/>
-              </w:rPr>
-              <w:t xml:space="preserve">Hosting y dominio anual: $1,100,000 - $1,500,000</w:t>
-            </w:r>
-          </w:p>
-          <w:p>
-            <w:pPr>
-              <w:ind w:left="0"/>
-              <w:rPr>
-                <w:rFonts w:ascii="Calibri" w:cs="Calibri" w:eastAsia="Calibri" w:hAnsi="Calibri"/>
-                <w:sz w:val="22"/>
-                <w:szCs w:val="22"/>
-              </w:rPr>
-            </w:pPr>
-            <w:r>
-              <w:rPr>
-                <w:rFonts w:ascii="Calibri" w:cs="Calibri" w:eastAsia="Calibri" w:hAnsi="Calibri"/>
-                <w:sz w:val="22"/>
-                <w:szCs w:val="22"/>
-                <w:rtl w:val="0"/>
-              </w:rPr>
-              <w:t xml:space="preserve">Contingencias (10%): $165,000 - $225,000</w:t>
-            </w:r>
-          </w:p>
-          <w:p>
-            <w:pPr>
-              <w:ind w:left="0"/>
-              <w:rPr>
-                <w:rFonts w:ascii="Calibri" w:cs="Calibri" w:eastAsia="Calibri" w:hAnsi="Calibri"/>
-                <w:sz w:val="22"/>
-                <w:szCs w:val="22"/>
-              </w:rPr>
-            </w:pPr>
-            <w:r>
-              <w:rPr>
-                <w:rFonts w:ascii="Calibri" w:cs="Calibri" w:eastAsia="Calibri" w:hAnsi="Calibri"/>
-                <w:sz w:val="22"/>
-                <w:szCs w:val="22"/>
-                <w:rtl w:val="0"/>
-              </w:rPr>
-              <w:t xml:space="preserve">Total: $1,265,000 - $1,725,000 CLP</w:t>
-            </w:r>
-          </w:p>
-          <w:p>
-            <w:pPr>
-              <w:ind w:left="0"/>
-              <w:rPr>
-                <w:rFonts w:ascii="Calibri" w:cs="Calibri" w:eastAsia="Calibri" w:hAnsi="Calibri"/>
-                <w:sz w:val="22"/>
-                <w:szCs w:val="22"/>
-              </w:rPr>
-            </w:pPr>
-            <w:r>
-              <w:rPr>
-                <w:rtl w:val="0"/>
-              </w:rPr>
-            </w:r>
-          </w:p>
-          <w:p>
-            <w:pPr>
-              <w:ind w:left="0"/>
-              <w:rPr>
-                <w:rFonts w:ascii="Calibri" w:cs="Calibri" w:eastAsia="Calibri" w:hAnsi="Calibri"/>
-                <w:sz w:val="22"/>
-                <w:szCs w:val="22"/>
-              </w:rPr>
-            </w:pPr>
-            <w:r>
-              <w:rPr>
-                <w:rtl w:val="0"/>
-              </w:rPr>
-            </w:r>
-          </w:p>
-          <w:p>
-            <w:pPr>
-              <w:ind w:left="0"/>
-              <w:rPr>
-                <w:rFonts w:ascii="Calibri" w:cs="Calibri" w:eastAsia="Calibri" w:hAnsi="Calibri"/>
-                <w:sz w:val="22"/>
-                <w:szCs w:val="22"/>
-              </w:rPr>
-            </w:pPr>
-            <w:r>
-              <w:rPr>
-                <w:rFonts w:ascii="Calibri" w:cs="Calibri" w:eastAsia="Calibri" w:hAnsi="Calibri"/>
-                <w:sz w:val="22"/>
-                <w:szCs w:val="22"/>
-                <w:rtl w:val="0"/>
-              </w:rPr>
-              <w:t xml:space="preserve">Tipo de comercio electrónico:</w:t>
-            </w:r>
-          </w:p>
-          <w:p>
-            <w:pPr>
-              <w:ind w:left="0"/>
-              <w:rPr>
-                <w:rFonts w:ascii="Calibri" w:cs="Calibri" w:eastAsia="Calibri" w:hAnsi="Calibri"/>
-                <w:sz w:val="22"/>
-                <w:szCs w:val="22"/>
-              </w:rPr>
-            </w:pPr>
-            <w:r>
-              <w:rPr>
-                <w:rFonts w:ascii="Calibri" w:cs="Calibri" w:eastAsia="Calibri" w:hAnsi="Calibri"/>
-                <w:sz w:val="22"/>
-                <w:szCs w:val="22"/>
-                <w:rtl w:val="0"/>
-              </w:rPr>
-              <w:t xml:space="preserve">La plataforma de Cordillera Pets se enmarca en el modelo </w:t>
-            </w:r>
-            <w:r>
-              <w:rPr>
-                <w:rFonts w:ascii="Calibri" w:cs="Calibri" w:eastAsia="Calibri" w:hAnsi="Calibri"/>
-                <w:sz w:val="22"/>
-                <w:szCs w:val="22"/>
-                <w:rtl w:val="0"/>
-              </w:rPr>
-              <w:t xml:space="preserve">B2C (Business to Consumer)</w:t>
-            </w:r>
-            <w:r>
-              <w:rPr>
-                <w:rFonts w:ascii="Calibri" w:cs="Calibri" w:eastAsia="Calibri" w:hAnsi="Calibri"/>
-                <w:sz w:val="22"/>
-                <w:szCs w:val="22"/>
-                <w:rtl w:val="0"/>
-              </w:rPr>
-              <w:t xml:space="preserve">, ya que la empresa venderá directamente sus productos a los clientes finales a través de un canal digital propio. Este enfoque permite ampliar el alcance de ventas, mejorar la experiencia de compra y fortalecer la relación con los consumidores.</w:t>
-            </w:r>
-          </w:p>
-          <w:p>
-            <w:pPr>
-              <w:ind w:left="0"/>
-              <w:rPr/>
-            </w:pPr>
-            <w:r>
-              <w:rPr>
-                <w:rtl w:val="0"/>
-              </w:rPr>
-            </w:r>
-          </w:p>
-          <w:p>
-            <w:pPr>
-              <w:spacing w:line="259" w:lineRule="auto"/>
-              <w:ind w:left="0" w:right="0"/>
-              <w:rPr>
-                <w:rFonts w:ascii="Calibri" w:cs="Calibri" w:eastAsia="Calibri" w:hAnsi="Calibri"/>
-                <w:sz w:val="22"/>
-                <w:szCs w:val="22"/>
-              </w:rPr>
-            </w:pPr>
-            <w:r>
-              <w:rPr>
-                <w:rFonts w:ascii="Calibri" w:cs="Calibri" w:eastAsia="Calibri" w:hAnsi="Calibri"/>
-                <w:sz w:val="22"/>
-                <w:szCs w:val="22"/>
-                <w:rtl w:val="0"/>
-              </w:rPr>
-              <w:t xml:space="preserve">El proyecto contempla el diseño, desarrollo, implementación y despliegue de una plataforma web e-commerce para Cordillera Pets que estará alojada en  , orientada a digitalizar sus procesos de venta y ofrecer una experiencia de compra moderna y eficiente para sus clientes.</w:t>
-            </w:r>
-          </w:p>
-          <w:p>
-            <w:pPr>
-              <w:spacing w:line="259" w:lineRule="auto"/>
-              <w:ind w:left="0" w:right="0"/>
-              <w:rPr>
-                <w:rFonts w:ascii="Calibri" w:cs="Calibri" w:eastAsia="Calibri" w:hAnsi="Calibri"/>
-                <w:sz w:val="22"/>
-                <w:szCs w:val="22"/>
-              </w:rPr>
-            </w:pPr>
-            <w:r>
-              <w:rPr>
-                <w:rFonts w:ascii="Calibri" w:cs="Calibri" w:eastAsia="Calibri" w:hAnsi="Calibri"/>
-                <w:sz w:val="22"/>
-                <w:szCs w:val="22"/>
-                <w:rtl w:val="0"/>
-              </w:rPr>
-              <w:t xml:space="preserve">La plataforma incluirá:</w:t>
+              </w:rPr>
+            </w:pPr>
+            <w:r>
+              <w:rPr>
+                <w:rFonts w:ascii="Calibri" w:cs="Calibri" w:eastAsia="Calibri" w:hAnsi="Calibri"/>
+                <w:sz w:val="22"/>
+                <w:szCs w:val="22"/>
+                <w:rtl w:val="0"/>
+              </w:rPr>
+              <w:t xml:space="preserve">Driver ORM: Psycopg 2.9.21</w:t>
             </w:r>
           </w:p>
           <w:p>
             <w:pPr>
               <w:numPr>
                 <w:ilvl w:val="0"/>
-                <w:numId w:val="8"/>
+                <w:numId w:val="6"/>
               </w:numPr>
-              <w:spacing w:line="259" w:lineRule="auto"/>
-              <w:ind w:left="720" w:right="0" w:hanging="360"/>
-              <w:rPr>
-                <w:rFonts w:ascii="Calibri" w:cs="Calibri" w:eastAsia="Calibri" w:hAnsi="Calibri"/>
-                <w:sz w:val="22"/>
-                <w:szCs w:val="22"/>
-                <w:u w:val="none"/>
-              </w:rPr>
-            </w:pPr>
-            <w:r>
-              <w:rPr>
-                <w:rFonts w:ascii="Calibri" w:cs="Calibri" w:eastAsia="Calibri" w:hAnsi="Calibri"/>
-                <w:sz w:val="22"/>
-                <w:szCs w:val="22"/>
-                <w:rtl w:val="0"/>
-              </w:rPr>
-              <w:t xml:space="preserve">Catálogo digital de productos con imágenes, precios y stock actualizado en tiempo real.</w:t>
+              <w:ind w:left="720" w:hanging="360"/>
+              <w:rPr>
+                <w:rFonts w:ascii="Calibri" w:cs="Calibri" w:eastAsia="Calibri" w:hAnsi="Calibri"/>
+                <w:sz w:val="22"/>
+                <w:szCs w:val="22"/>
+              </w:rPr>
+            </w:pPr>
+            <w:r>
+              <w:rPr>
+                <w:rFonts w:ascii="Calibri" w:cs="Calibri" w:eastAsia="Calibri" w:hAnsi="Calibri"/>
+                <w:sz w:val="22"/>
+                <w:szCs w:val="22"/>
+                <w:rtl w:val="0"/>
+              </w:rPr>
+              <w:t xml:space="preserve">Lenguaje: Python 3.12</w:t>
             </w:r>
           </w:p>
           <w:p>
             <w:pPr>
               <w:numPr>
                 <w:ilvl w:val="0"/>
-                <w:numId w:val="8"/>
+                <w:numId w:val="6"/>
               </w:numPr>
-              <w:spacing w:line="259" w:lineRule="auto"/>
-              <w:ind w:left="720" w:right="0" w:hanging="360"/>
-              <w:rPr>
-                <w:rFonts w:ascii="Calibri" w:cs="Calibri" w:eastAsia="Calibri" w:hAnsi="Calibri"/>
-                <w:sz w:val="22"/>
-                <w:szCs w:val="22"/>
-                <w:u w:val="none"/>
-              </w:rPr>
-            </w:pPr>
-            <w:r>
-              <w:rPr>
-                <w:rFonts w:ascii="Calibri" w:cs="Calibri" w:eastAsia="Calibri" w:hAnsi="Calibri"/>
-                <w:sz w:val="22"/>
-                <w:szCs w:val="22"/>
-                <w:rtl w:val="0"/>
-              </w:rPr>
-              <w:t xml:space="preserve">Carrito de compras con cálculo automático del total y gestión de pedidos.</w:t>
+              <w:ind w:left="720" w:hanging="360"/>
+              <w:rPr>
+                <w:rFonts w:ascii="Calibri" w:cs="Calibri" w:eastAsia="Calibri" w:hAnsi="Calibri"/>
+                <w:sz w:val="22"/>
+                <w:szCs w:val="22"/>
+              </w:rPr>
+            </w:pPr>
+            <w:r>
+              <w:rPr>
+                <w:rFonts w:ascii="Calibri" w:cs="Calibri" w:eastAsia="Calibri" w:hAnsi="Calibri"/>
+                <w:sz w:val="22"/>
+                <w:szCs w:val="22"/>
+                <w:rtl w:val="0"/>
+              </w:rPr>
+              <w:t xml:space="preserve">Frontend Framework: Bootstrap 5</w:t>
             </w:r>
           </w:p>
           <w:p>
             <w:pPr>
               <w:numPr>
                 <w:ilvl w:val="0"/>
-                <w:numId w:val="8"/>
+                <w:numId w:val="6"/>
               </w:numPr>
-              <w:spacing w:line="259" w:lineRule="auto"/>
-              <w:ind w:left="720" w:right="0" w:hanging="360"/>
-              <w:rPr>
-                <w:rFonts w:ascii="Calibri" w:cs="Calibri" w:eastAsia="Calibri" w:hAnsi="Calibri"/>
-                <w:sz w:val="22"/>
-                <w:szCs w:val="22"/>
-                <w:u w:val="none"/>
-              </w:rPr>
-            </w:pPr>
-            <w:r>
-              <w:rPr>
-                <w:rFonts w:ascii="Calibri" w:cs="Calibri" w:eastAsia="Calibri" w:hAnsi="Calibri"/>
-                <w:sz w:val="22"/>
-                <w:szCs w:val="22"/>
-                <w:rtl w:val="0"/>
-              </w:rPr>
-              <w:t xml:space="preserve">Pasarela de pago en línea segura, integrando medios de pago locales (ej. Transbank) y tarjetas de crédito/débito.</w:t>
+              <w:ind w:left="720" w:hanging="360"/>
+              <w:rPr>
+                <w:rFonts w:ascii="Calibri" w:cs="Calibri" w:eastAsia="Calibri" w:hAnsi="Calibri"/>
+                <w:sz w:val="22"/>
+                <w:szCs w:val="22"/>
+              </w:rPr>
+            </w:pPr>
+            <w:r>
+              <w:rPr>
+                <w:rFonts w:ascii="Calibri" w:cs="Calibri" w:eastAsia="Calibri" w:hAnsi="Calibri"/>
+                <w:sz w:val="22"/>
+                <w:szCs w:val="22"/>
+                <w:rtl w:val="0"/>
+              </w:rPr>
+              <w:t xml:space="preserve">Almacenamiento: DigitalOcean Spaces (S3-compatible)</w:t>
             </w:r>
           </w:p>
           <w:p>
             <w:pPr>
               <w:numPr>
                 <w:ilvl w:val="0"/>
-                <w:numId w:val="8"/>
+                <w:numId w:val="6"/>
               </w:numPr>
-              <w:spacing w:line="259" w:lineRule="auto"/>
-              <w:ind w:left="720" w:right="0" w:hanging="360"/>
-              <w:rPr>
-                <w:rFonts w:ascii="Calibri" w:cs="Calibri" w:eastAsia="Calibri" w:hAnsi="Calibri"/>
-                <w:sz w:val="22"/>
-                <w:szCs w:val="22"/>
-                <w:u w:val="none"/>
-              </w:rPr>
-            </w:pPr>
-            <w:r>
-              <w:rPr>
-                <w:rFonts w:ascii="Calibri" w:cs="Calibri" w:eastAsia="Calibri" w:hAnsi="Calibri"/>
-                <w:sz w:val="22"/>
-                <w:szCs w:val="22"/>
-                <w:rtl w:val="0"/>
-              </w:rPr>
-              <w:t xml:space="preserve">Registro y autenticación de clientes, con perfil de usuario e historial de compras.</w:t>
+              <w:ind w:left="720" w:hanging="360"/>
+              <w:rPr>
+                <w:rFonts w:ascii="Calibri" w:cs="Calibri" w:eastAsia="Calibri" w:hAnsi="Calibri"/>
+                <w:sz w:val="22"/>
+                <w:szCs w:val="22"/>
+              </w:rPr>
+            </w:pPr>
+            <w:r>
+              <w:rPr>
+                <w:rFonts w:ascii="Calibri" w:cs="Calibri" w:eastAsia="Calibri" w:hAnsi="Calibri"/>
+                <w:sz w:val="22"/>
+                <w:szCs w:val="22"/>
+                <w:rtl w:val="0"/>
+              </w:rPr>
+              <w:t xml:space="preserve">Email Marketing: Brevo (Sendinblue) API v3</w:t>
             </w:r>
           </w:p>
           <w:p>
             <w:pPr>
               <w:numPr>
                 <w:ilvl w:val="0"/>
-                <w:numId w:val="8"/>
+                <w:numId w:val="6"/>
               </w:numPr>
-              <w:spacing w:line="259" w:lineRule="auto"/>
-              <w:ind w:left="720" w:right="0" w:hanging="360"/>
-              <w:rPr>
-                <w:rFonts w:ascii="Calibri" w:cs="Calibri" w:eastAsia="Calibri" w:hAnsi="Calibri"/>
-                <w:sz w:val="22"/>
-                <w:szCs w:val="22"/>
-                <w:u w:val="none"/>
-              </w:rPr>
-            </w:pPr>
-            <w:r>
-              <w:rPr>
-                <w:rFonts w:ascii="Calibri" w:cs="Calibri" w:eastAsia="Calibri" w:hAnsi="Calibri"/>
-                <w:sz w:val="22"/>
-                <w:szCs w:val="22"/>
-                <w:rtl w:val="0"/>
-              </w:rPr>
-              <w:t xml:space="preserve">Notificaciones automáticas por correo electrónico sobre estado del pedido y despacho.</w:t>
+              <w:ind w:left="720" w:hanging="360"/>
+              <w:rPr>
+                <w:rFonts w:ascii="Calibri" w:cs="Calibri" w:eastAsia="Calibri" w:hAnsi="Calibri"/>
+                <w:sz w:val="22"/>
+                <w:szCs w:val="22"/>
+              </w:rPr>
+            </w:pPr>
+            <w:r>
+              <w:rPr>
+                <w:rFonts w:ascii="Calibri" w:cs="Calibri" w:eastAsia="Calibri" w:hAnsi="Calibri"/>
+                <w:sz w:val="22"/>
+                <w:szCs w:val="22"/>
+                <w:rtl w:val="0"/>
+              </w:rPr>
+              <w:t xml:space="preserve">Cálculo de Envíos: MultiCourier API vía RapidAPI</w:t>
             </w:r>
           </w:p>
           <w:p>
             <w:pPr>
               <w:numPr>
                 <w:ilvl w:val="0"/>
-                <w:numId w:val="8"/>
+                <w:numId w:val="6"/>
               </w:numPr>
-              <w:spacing w:line="259" w:lineRule="auto"/>
-              <w:ind w:left="720" w:right="0" w:hanging="360"/>
-              <w:rPr>
-                <w:rFonts w:ascii="Calibri" w:cs="Calibri" w:eastAsia="Calibri" w:hAnsi="Calibri"/>
-                <w:sz w:val="22"/>
-                <w:szCs w:val="22"/>
-                <w:u w:val="none"/>
-              </w:rPr>
-            </w:pPr>
-            <w:r>
-              <w:rPr>
-                <w:rFonts w:ascii="Calibri" w:cs="Calibri" w:eastAsia="Calibri" w:hAnsi="Calibri"/>
-                <w:sz w:val="22"/>
-                <w:szCs w:val="22"/>
-                <w:rtl w:val="0"/>
-              </w:rPr>
-              <w:t xml:space="preserve">Panel administrativo para gestionar productos, pedidos y stock.</w:t>
+              <w:ind w:left="720" w:hanging="360"/>
+              <w:rPr>
+                <w:rFonts w:ascii="Calibri" w:cs="Calibri" w:eastAsia="Calibri" w:hAnsi="Calibri"/>
+                <w:sz w:val="22"/>
+                <w:szCs w:val="22"/>
+              </w:rPr>
+            </w:pPr>
+            <w:r>
+              <w:rPr>
+                <w:rFonts w:ascii="Calibri" w:cs="Calibri" w:eastAsia="Calibri" w:hAnsi="Calibri"/>
+                <w:sz w:val="22"/>
+                <w:szCs w:val="22"/>
+                <w:rtl w:val="0"/>
+              </w:rPr>
+              <w:t xml:space="preserve">Control de Versiones: GitHub</w:t>
             </w:r>
           </w:p>
           <w:p>
             <w:pPr>
               <w:numPr>
                 <w:ilvl w:val="0"/>
-                <w:numId w:val="8"/>
+                <w:numId w:val="6"/>
               </w:numPr>
-              <w:spacing w:line="259" w:lineRule="auto"/>
-              <w:ind w:left="720" w:right="0" w:hanging="360"/>
+              <w:ind w:left="720" w:hanging="360"/>
               <w:rPr>
                 <w:rFonts w:ascii="Calibri" w:cs="Calibri" w:eastAsia="Calibri" w:hAnsi="Calibri"/>
                 <w:sz w:val="22"/>
@@ -1762,202 +1315,168 @@
                 <w:szCs w:val="22"/>
                 <w:rtl w:val="0"/>
               </w:rPr>
-              <w:t xml:space="preserve">Reportes de ventas mensuales para apoyar la gestión del negocio.</w:t>
-            </w:r>
-          </w:p>
-          <w:p>
-            <w:pPr>
-              <w:numPr>
-                <w:ilvl w:val="0"/>
-                <w:numId w:val="8"/>
-              </w:numPr>
-              <w:spacing w:line="259" w:lineRule="auto"/>
-              <w:ind w:left="720" w:right="0" w:hanging="360"/>
-              <w:rPr>
-                <w:rFonts w:ascii="Calibri" w:cs="Calibri" w:eastAsia="Calibri" w:hAnsi="Calibri"/>
-                <w:sz w:val="22"/>
-                <w:szCs w:val="22"/>
-                <w:u w:val="none"/>
-              </w:rPr>
-            </w:pPr>
-            <w:r>
-              <w:rPr>
-                <w:rFonts w:ascii="Calibri" w:cs="Calibri" w:eastAsia="Calibri" w:hAnsi="Calibri"/>
-                <w:sz w:val="22"/>
-                <w:szCs w:val="22"/>
-                <w:rtl w:val="0"/>
-              </w:rPr>
-              <w:t xml:space="preserve">Diseño responsive que garantice accesibilidad desde computadores, tablets y smartphones.</w:t>
+              <w:t xml:space="preserve">Modelado: PlantUML, Mermaid</w:t>
+            </w:r>
+          </w:p>
+          <w:p>
+            <w:pPr>
+              <w:ind w:left="0" w:firstLine="0"/>
+              <w:rPr>
+                <w:rFonts w:ascii="Calibri" w:cs="Calibri" w:eastAsia="Calibri" w:hAnsi="Calibri"/>
+                <w:sz w:val="22"/>
+                <w:szCs w:val="22"/>
+              </w:rPr>
+            </w:pPr>
+            <w:r>
+              <w:rPr>
+                <w:rtl w:val="0"/>
+              </w:rPr>
+            </w:r>
+          </w:p>
+          <w:p>
+            <w:pPr>
+              <w:ind w:left="0" w:firstLine="0"/>
+              <w:rPr>
+                <w:rFonts w:ascii="Calibri" w:cs="Calibri" w:eastAsia="Calibri" w:hAnsi="Calibri"/>
+                <w:sz w:val="22"/>
+                <w:szCs w:val="22"/>
+              </w:rPr>
+            </w:pPr>
+            <w:r>
+              <w:rPr>
+                <w:rFonts w:ascii="Calibri" w:cs="Calibri" w:eastAsia="Calibri" w:hAnsi="Calibri"/>
+                <w:sz w:val="22"/>
+                <w:szCs w:val="22"/>
+                <w:rtl w:val="0"/>
+              </w:rPr>
+              <w:t xml:space="preserve">Línea de Tiempo (17 semanas)</w:t>
+            </w:r>
+          </w:p>
+          <w:p>
+            <w:pPr>
+              <w:ind w:left="0" w:firstLine="0"/>
+              <w:rPr>
+                <w:rFonts w:ascii="Calibri" w:cs="Calibri" w:eastAsia="Calibri" w:hAnsi="Calibri"/>
+                <w:sz w:val="22"/>
+                <w:szCs w:val="22"/>
+              </w:rPr>
+            </w:pPr>
+            <w:r>
+              <w:rPr>
+                <w:rtl w:val="0"/>
+              </w:rPr>
+            </w:r>
+          </w:p>
+          <w:p>
+            <w:pPr>
+              <w:spacing w:line="259" w:lineRule="auto"/>
+              <w:ind w:left="0" w:right="0"/>
+              <w:rPr>
+                <w:rFonts w:ascii="Calibri" w:cs="Calibri" w:eastAsia="Calibri" w:hAnsi="Calibri"/>
+                <w:sz w:val="22"/>
+                <w:szCs w:val="22"/>
+              </w:rPr>
+            </w:pPr>
+            <w:r>
+              <w:rPr>
+                <w:rFonts w:ascii="Calibri" w:cs="Calibri" w:eastAsia="Calibri" w:hAnsi="Calibri"/>
+                <w:sz w:val="22"/>
+                <w:szCs w:val="22"/>
+                <w:rtl w:val="0"/>
+              </w:rPr>
+              <w:t xml:space="preserve">Metodología de trabajo: Ágil híbrida con desarrollo en sprints de 2 semanas, retroalimentación continua y validación con el cliente.</w:t>
+            </w:r>
+          </w:p>
+          <w:p>
+            <w:pPr>
+              <w:ind w:left="0" w:firstLine="0"/>
+              <w:rPr>
+                <w:rFonts w:ascii="Calibri" w:cs="Calibri" w:eastAsia="Calibri" w:hAnsi="Calibri"/>
+                <w:sz w:val="22"/>
+                <w:szCs w:val="22"/>
+              </w:rPr>
+            </w:pPr>
+            <w:r>
+              <w:rPr>
+                <w:rtl w:val="0"/>
+              </w:rPr>
+            </w:r>
+          </w:p>
+          <w:p>
+            <w:pPr>
+              <w:ind w:left="0" w:firstLine="0"/>
+              <w:rPr>
+                <w:rFonts w:ascii="Calibri" w:cs="Calibri" w:eastAsia="Calibri" w:hAnsi="Calibri"/>
+                <w:sz w:val="22"/>
+                <w:szCs w:val="22"/>
+              </w:rPr>
+            </w:pPr>
+            <w:r>
+              <w:rPr>
+                <w:rFonts w:ascii="Calibri" w:cs="Calibri" w:eastAsia="Calibri" w:hAnsi="Calibri"/>
+                <w:sz w:val="22"/>
+                <w:szCs w:val="22"/>
+                <w:rtl w:val="0"/>
+              </w:rPr>
+              <w:t xml:space="preserve">Costos</w:t>
+            </w:r>
+          </w:p>
+          <w:p>
+            <w:pPr>
+              <w:ind w:left="0" w:firstLine="0"/>
+              <w:rPr>
+                <w:rFonts w:ascii="Calibri" w:cs="Calibri" w:eastAsia="Calibri" w:hAnsi="Calibri"/>
+                <w:sz w:val="22"/>
+                <w:szCs w:val="22"/>
+              </w:rPr>
+            </w:pPr>
+            <w:r>
+              <w:rPr>
+                <w:rFonts w:ascii="Calibri" w:cs="Calibri" w:eastAsia="Calibri" w:hAnsi="Calibri"/>
+                <w:sz w:val="22"/>
+                <w:szCs w:val="22"/>
+                <w:rtl w:val="0"/>
+              </w:rPr>
+              <w:t xml:space="preserve">Desarrollo del proyecto: $5.147.164</w:t>
+            </w:r>
+          </w:p>
+          <w:p>
+            <w:pPr>
+              <w:ind w:left="0" w:firstLine="0"/>
+              <w:rPr>
+                <w:rFonts w:ascii="Calibri" w:cs="Calibri" w:eastAsia="Calibri" w:hAnsi="Calibri"/>
+                <w:sz w:val="22"/>
+                <w:szCs w:val="22"/>
+              </w:rPr>
+            </w:pPr>
+            <w:r>
+              <w:rPr>
+                <w:rFonts w:ascii="Calibri" w:cs="Calibri" w:eastAsia="Calibri" w:hAnsi="Calibri"/>
+                <w:sz w:val="22"/>
+                <w:szCs w:val="22"/>
+                <w:rtl w:val="0"/>
+              </w:rPr>
+              <w:t xml:space="preserve">Mantención mensual: $47.164</w:t>
             </w:r>
           </w:p>
           <w:p>
             <w:pPr>
               <w:pStyle w:val="Heading1"/>
               <w:spacing w:line="259" w:lineRule="auto"/>
-              <w:ind w:left="0" w:right="0"/>
-              <w:rPr>
-                <w:rFonts w:ascii="Calibri" w:cs="Calibri" w:eastAsia="Calibri" w:hAnsi="Calibri"/>
-                <w:sz w:val="22"/>
-                <w:szCs w:val="22"/>
-              </w:rPr>
-            </w:pPr>
-            <w:bookmarkStart w:colFirst="0" w:colLast="0" w:name="_heading=h.18junob250ap" w:id="4"/>
+              <w:ind w:left="0" w:right="0" w:firstLine="0"/>
+              <w:rPr>
+                <w:rFonts w:ascii="Calibri" w:cs="Calibri" w:eastAsia="Calibri" w:hAnsi="Calibri"/>
+                <w:sz w:val="22"/>
+                <w:szCs w:val="22"/>
+              </w:rPr>
+            </w:pPr>
+            <w:bookmarkStart w:colFirst="0" w:colLast="0" w:name="_heading=h.l4ubktsmqjtd" w:id="4"/>
             <w:bookmarkEnd w:id="4"/>
             <w:r>
               <w:rPr>
                 <w:rtl w:val="0"/>
               </w:rPr>
-              <w:t xml:space="preserve">Alcance del Desarrollo</w:t>
-            </w:r>
-            <w:r>
-              <w:rPr>
-                <w:rtl w:val="0"/>
-              </w:rPr>
-            </w:r>
-          </w:p>
-          <w:p>
-            <w:pPr>
-              <w:numPr>
-                <w:ilvl w:val="0"/>
-                <w:numId w:val="7"/>
-              </w:numPr>
-              <w:spacing w:line="259" w:lineRule="auto"/>
-              <w:ind w:left="720" w:right="0" w:hanging="360"/>
-              <w:rPr>
-                <w:rFonts w:ascii="Calibri" w:cs="Calibri" w:eastAsia="Calibri" w:hAnsi="Calibri"/>
-                <w:sz w:val="22"/>
-                <w:szCs w:val="22"/>
-                <w:u w:val="none"/>
-              </w:rPr>
-            </w:pPr>
-            <w:r>
-              <w:rPr>
-                <w:rFonts w:ascii="Calibri" w:cs="Calibri" w:eastAsia="Calibri" w:hAnsi="Calibri"/>
-                <w:sz w:val="22"/>
-                <w:szCs w:val="22"/>
-                <w:rtl w:val="0"/>
-              </w:rPr>
-              <w:t xml:space="preserve">Framework: Django</w:t>
-            </w:r>
-          </w:p>
-          <w:p>
-            <w:pPr>
-              <w:numPr>
-                <w:ilvl w:val="0"/>
-                <w:numId w:val="7"/>
-              </w:numPr>
-              <w:spacing w:line="259" w:lineRule="auto"/>
-              <w:ind w:left="720" w:right="0" w:hanging="360"/>
-              <w:rPr>
-                <w:rFonts w:ascii="Calibri" w:cs="Calibri" w:eastAsia="Calibri" w:hAnsi="Calibri"/>
-                <w:sz w:val="22"/>
-                <w:szCs w:val="22"/>
-                <w:u w:val="none"/>
-              </w:rPr>
-            </w:pPr>
-            <w:r>
-              <w:rPr>
-                <w:rFonts w:ascii="Calibri" w:cs="Calibri" w:eastAsia="Calibri" w:hAnsi="Calibri"/>
-                <w:sz w:val="22"/>
-                <w:szCs w:val="22"/>
-                <w:rtl w:val="0"/>
-              </w:rPr>
-              <w:t xml:space="preserve">Base de datos: MariaDB.</w:t>
-            </w:r>
-          </w:p>
-          <w:p>
-            <w:pPr>
-              <w:numPr>
-                <w:ilvl w:val="0"/>
-                <w:numId w:val="7"/>
-              </w:numPr>
-              <w:spacing w:line="259" w:lineRule="auto"/>
-              <w:ind w:left="720" w:right="0" w:hanging="360"/>
-              <w:rPr>
-                <w:rFonts w:ascii="Calibri" w:cs="Calibri" w:eastAsia="Calibri" w:hAnsi="Calibri"/>
-                <w:sz w:val="22"/>
-                <w:szCs w:val="22"/>
-                <w:u w:val="none"/>
-              </w:rPr>
-            </w:pPr>
-            <w:r>
-              <w:rPr>
-                <w:rFonts w:ascii="Calibri" w:cs="Calibri" w:eastAsia="Calibri" w:hAnsi="Calibri"/>
-                <w:sz w:val="22"/>
-                <w:szCs w:val="22"/>
-                <w:rtl w:val="0"/>
-              </w:rPr>
-              <w:t xml:space="preserve">Pasarela de pago en línea WebPay Plus.</w:t>
-            </w:r>
-          </w:p>
-          <w:p>
-            <w:pPr>
-              <w:numPr>
-                <w:ilvl w:val="0"/>
-                <w:numId w:val="7"/>
-              </w:numPr>
-              <w:spacing w:line="259" w:lineRule="auto"/>
-              <w:ind w:left="720" w:right="0" w:hanging="360"/>
-              <w:rPr>
-                <w:rFonts w:ascii="Calibri" w:cs="Calibri" w:eastAsia="Calibri" w:hAnsi="Calibri"/>
-                <w:sz w:val="22"/>
-                <w:szCs w:val="22"/>
-                <w:u w:val="none"/>
-              </w:rPr>
-            </w:pPr>
-            <w:r>
-              <w:rPr>
-                <w:rFonts w:ascii="Calibri" w:cs="Calibri" w:eastAsia="Calibri" w:hAnsi="Calibri"/>
-                <w:sz w:val="22"/>
-                <w:szCs w:val="22"/>
-                <w:rtl w:val="0"/>
-              </w:rPr>
-              <w:t xml:space="preserve">Servicio de correo electrónico para notificaciones.</w:t>
-            </w:r>
-          </w:p>
-          <w:p>
-            <w:pPr>
-              <w:numPr>
-                <w:ilvl w:val="0"/>
-                <w:numId w:val="7"/>
-              </w:numPr>
-              <w:spacing w:line="259" w:lineRule="auto"/>
-              <w:ind w:left="720" w:right="0" w:hanging="360"/>
-              <w:rPr>
-                <w:rFonts w:ascii="Calibri" w:cs="Calibri" w:eastAsia="Calibri" w:hAnsi="Calibri"/>
-                <w:sz w:val="22"/>
-                <w:szCs w:val="22"/>
-                <w:u w:val="none"/>
-              </w:rPr>
-            </w:pPr>
-            <w:r>
-              <w:rPr>
-                <w:rFonts w:ascii="Calibri" w:cs="Calibri" w:eastAsia="Calibri" w:hAnsi="Calibri"/>
-                <w:sz w:val="22"/>
-                <w:szCs w:val="22"/>
-                <w:rtl w:val="0"/>
-              </w:rPr>
-              <w:t xml:space="preserve">Metodología de trabajo: Ágil con desarrollo en sprints de 2 semanas, retroalimentación continua y validación con el cliente.</w:t>
-            </w:r>
-          </w:p>
-          <w:p>
-            <w:pPr>
-              <w:pStyle w:val="Heading1"/>
-              <w:spacing w:line="259" w:lineRule="auto"/>
-              <w:ind w:left="0" w:right="0"/>
-              <w:rPr>
-                <w:rFonts w:ascii="Calibri" w:cs="Calibri" w:eastAsia="Calibri" w:hAnsi="Calibri"/>
-                <w:sz w:val="22"/>
-                <w:szCs w:val="22"/>
-              </w:rPr>
-            </w:pPr>
-            <w:bookmarkStart w:colFirst="0" w:colLast="0" w:name="_heading=h.l4ubktsmqjtd" w:id="5"/>
-            <w:bookmarkEnd w:id="5"/>
-            <w:r>
-              <w:rPr>
-                <w:rtl w:val="0"/>
-              </w:rPr>
-              <w:t xml:space="preserve">Alcance del Producto</w:t>
+              <w:t xml:space="preserve">Alcance del Software</w:t>
             </w:r>
             <w:r>
               <w:rPr>
@@ -1977,17 +1496,16 @@
                 <w:rFonts w:ascii="Calibri" w:cs="Calibri" w:eastAsia="Calibri" w:hAnsi="Calibri"/>
                 <w:sz w:val="22"/>
                 <w:szCs w:val="22"/>
-                <w:u w:val="none"/>
-              </w:rPr>
-            </w:pPr>
-            <w:r>
-              <w:rPr>
-                <w:rFonts w:ascii="Calibri" w:cs="Calibri" w:eastAsia="Calibri" w:hAnsi="Calibri"/>
-                <w:sz w:val="22"/>
-                <w:szCs w:val="22"/>
-                <w:rtl w:val="0"/>
-              </w:rPr>
-              <w:t xml:space="preserve">Gestionar de forma centralizada productos, pedidos y stock.</w:t>
+              </w:rPr>
+            </w:pPr>
+            <w:r>
+              <w:rPr>
+                <w:rFonts w:ascii="Calibri" w:cs="Calibri" w:eastAsia="Calibri" w:hAnsi="Calibri"/>
+                <w:sz w:val="22"/>
+                <w:szCs w:val="22"/>
+                <w:rtl w:val="0"/>
+              </w:rPr>
+              <w:t xml:space="preserve">Desarrollo de una página web responsiva, accesible desde computador, tablet y smartphone.</w:t>
             </w:r>
           </w:p>
           <w:p>
@@ -2002,17 +1520,16 @@
                 <w:rFonts w:ascii="Calibri" w:cs="Calibri" w:eastAsia="Calibri" w:hAnsi="Calibri"/>
                 <w:sz w:val="22"/>
                 <w:szCs w:val="22"/>
-                <w:u w:val="none"/>
-              </w:rPr>
-            </w:pPr>
-            <w:r>
-              <w:rPr>
-                <w:rFonts w:ascii="Calibri" w:cs="Calibri" w:eastAsia="Calibri" w:hAnsi="Calibri"/>
-                <w:sz w:val="22"/>
-                <w:szCs w:val="22"/>
-                <w:rtl w:val="0"/>
-              </w:rPr>
-              <w:t xml:space="preserve">Aumentar el alcance de ventas al ofrecer un canal digital propio.</w:t>
+              </w:rPr>
+            </w:pPr>
+            <w:r>
+              <w:rPr>
+                <w:rFonts w:ascii="Calibri" w:cs="Calibri" w:eastAsia="Calibri" w:hAnsi="Calibri"/>
+                <w:sz w:val="22"/>
+                <w:szCs w:val="22"/>
+                <w:rtl w:val="0"/>
+              </w:rPr>
+              <w:t xml:space="preserve">El sistema incluirá módulos de: Ventas, catálogo digital, carrito de compras y proceso de checkout</w:t>
             </w:r>
           </w:p>
           <w:p>
@@ -2027,17 +1544,16 @@
                 <w:rFonts w:ascii="Calibri" w:cs="Calibri" w:eastAsia="Calibri" w:hAnsi="Calibri"/>
                 <w:sz w:val="22"/>
                 <w:szCs w:val="22"/>
-                <w:u w:val="none"/>
-              </w:rPr>
-            </w:pPr>
-            <w:r>
-              <w:rPr>
-                <w:rFonts w:ascii="Calibri" w:cs="Calibri" w:eastAsia="Calibri" w:hAnsi="Calibri"/>
-                <w:sz w:val="22"/>
-                <w:szCs w:val="22"/>
-                <w:rtl w:val="0"/>
-              </w:rPr>
-              <w:t xml:space="preserve">Mejorar la experiencia de compra de los clientes, reduciendo tiempos y simplificando el proceso.</w:t>
+              </w:rPr>
+            </w:pPr>
+            <w:r>
+              <w:rPr>
+                <w:rFonts w:ascii="Calibri" w:cs="Calibri" w:eastAsia="Calibri" w:hAnsi="Calibri"/>
+                <w:sz w:val="22"/>
+                <w:szCs w:val="22"/>
+                <w:rtl w:val="0"/>
+              </w:rPr>
+              <w:t xml:space="preserve">Dashboard administrativo para gestión de productos, pedidos y stock</w:t>
             </w:r>
           </w:p>
           <w:p>
@@ -2052,17 +1568,16 @@
                 <w:rFonts w:ascii="Calibri" w:cs="Calibri" w:eastAsia="Calibri" w:hAnsi="Calibri"/>
                 <w:sz w:val="22"/>
                 <w:szCs w:val="22"/>
-                <w:u w:val="none"/>
-              </w:rPr>
-            </w:pPr>
-            <w:r>
-              <w:rPr>
-                <w:rFonts w:ascii="Calibri" w:cs="Calibri" w:eastAsia="Calibri" w:hAnsi="Calibri"/>
-                <w:sz w:val="22"/>
-                <w:szCs w:val="22"/>
-                <w:rtl w:val="0"/>
-              </w:rPr>
-              <w:t xml:space="preserve">Disponer de herramientas de análisis y reportes para la toma de decisiones estratégicas.</w:t>
+              </w:rPr>
+            </w:pPr>
+            <w:r>
+              <w:rPr>
+                <w:rFonts w:ascii="Calibri" w:cs="Calibri" w:eastAsia="Calibri" w:hAnsi="Calibri"/>
+                <w:sz w:val="22"/>
+                <w:szCs w:val="22"/>
+                <w:rtl w:val="0"/>
+              </w:rPr>
+              <w:t xml:space="preserve">El e-commerce permitirá pagos en línea a través de Webpay/Transbank con excepción de transferencia bancaria.</w:t>
             </w:r>
           </w:p>
           <w:p>
@@ -2077,23 +1592,46 @@
                 <w:rFonts w:ascii="Calibri" w:cs="Calibri" w:eastAsia="Calibri" w:hAnsi="Calibri"/>
                 <w:sz w:val="22"/>
                 <w:szCs w:val="22"/>
-                <w:u w:val="none"/>
-              </w:rPr>
-            </w:pPr>
-            <w:r>
-              <w:rPr>
-                <w:rFonts w:ascii="Calibri" w:cs="Calibri" w:eastAsia="Calibri" w:hAnsi="Calibri"/>
-                <w:sz w:val="22"/>
-                <w:szCs w:val="22"/>
-                <w:rtl w:val="0"/>
-              </w:rPr>
-              <w:t xml:space="preserve">Escalar en el futuro con nuevas funcionalidades (ej. cupones de descuento o integración con aplicaciones móviles).</w:t>
-            </w:r>
-          </w:p>
-          <w:p>
-            <w:pPr>
-              <w:spacing w:line="259" w:lineRule="auto"/>
-              <w:ind w:left="0" w:right="0"/>
+              </w:rPr>
+            </w:pPr>
+            <w:r>
+              <w:rPr>
+                <w:rFonts w:ascii="Calibri" w:cs="Calibri" w:eastAsia="Calibri" w:hAnsi="Calibri"/>
+                <w:sz w:val="22"/>
+                <w:szCs w:val="22"/>
+                <w:rtl w:val="0"/>
+              </w:rPr>
+              <w:t xml:space="preserve">El software contará con notificaciones automáticas, historial de compras y manejo de usuarios registrados.</w:t>
+            </w:r>
+          </w:p>
+          <w:p>
+            <w:pPr>
+              <w:numPr>
+                <w:ilvl w:val="0"/>
+                <w:numId w:val="1"/>
+              </w:numPr>
+              <w:spacing w:line="259" w:lineRule="auto"/>
+              <w:ind w:left="720" w:right="0" w:hanging="360"/>
+              <w:rPr>
+                <w:rFonts w:ascii="Calibri" w:cs="Calibri" w:eastAsia="Calibri" w:hAnsi="Calibri"/>
+                <w:sz w:val="22"/>
+                <w:szCs w:val="22"/>
+              </w:rPr>
+            </w:pPr>
+            <w:r>
+              <w:rPr>
+                <w:rFonts w:ascii="Calibri" w:cs="Calibri" w:eastAsia="Calibri" w:hAnsi="Calibri"/>
+                <w:sz w:val="22"/>
+                <w:szCs w:val="22"/>
+                <w:rtl w:val="0"/>
+              </w:rPr>
+              <w:t xml:space="preserve">La solución garantizará seguridad, encriptación de datos y disponibilidad 24/7</w:t>
+            </w:r>
+          </w:p>
+          <w:p>
+            <w:pPr>
+              <w:spacing w:line="259" w:lineRule="auto"/>
+              <w:ind w:left="0" w:right="0" w:firstLine="0"/>
               <w:rPr>
                 <w:rFonts w:ascii="Calibri" w:cs="Calibri" w:eastAsia="Calibri" w:hAnsi="Calibri"/>
                 <w:sz w:val="22"/>
@@ -2183,6 +1721,11 @@
               </w:rPr>
               <w:t xml:space="preserve">Plataforma e-commerce con catálogo, carrito de compras, pagos en línea y sección de noticias.</w:t>
             </w:r>
+            <w:r>
+              <w:rPr>
+                <w:rtl w:val="0"/>
+              </w:rPr>
+            </w:r>
           </w:p>
           <w:p>
             <w:pPr>
@@ -2208,6 +1751,11 @@
               </w:rPr>
               <w:t xml:space="preserve">Disponibilidad de la plataforma en producción, accesible desde dispositivos móviles y de escritorio</w:t>
             </w:r>
+            <w:r>
+              <w:rPr>
+                <w:rtl w:val="0"/>
+              </w:rPr>
+            </w:r>
           </w:p>
           <w:p>
             <w:pPr>
@@ -2256,6 +1804,11 @@
                 <w:rtl w:val="0"/>
               </w:rPr>
               <w:t xml:space="preserve">Generación de reportes mensuales de ventas y stock, disponibles para la gerencia.</w:t>
+            </w:r>
+            <w:r>
+              <w:rPr>
+                <w:rtl w:val="0"/>
+              </w:rPr>
             </w:r>
           </w:p>
           <w:p>
@@ -2530,7 +2083,7 @@
                 <w:szCs w:val="22"/>
                 <w:rtl w:val="0"/>
               </w:rPr>
-              <w:t xml:space="preserve">Semana 3-. Diseño UI/UX, mockup, documento de arquitectura.</w:t>
+              <w:t xml:space="preserve">Semana 3-. Diseño UI/UX y mockup.</w:t>
             </w:r>
           </w:p>
           <w:p>
@@ -2570,7 +2123,7 @@
                 <w:szCs w:val="22"/>
                 <w:rtl w:val="0"/>
               </w:rPr>
-              <w:t xml:space="preserve">Semana 5-6-. Desarrollo inicial del frontend del catálogo de productos y pruebas unitarias.</w:t>
+              <w:t xml:space="preserve">Semana 5-6-. Desarrollo inicial del frontend del catálogo de productos.</w:t>
             </w:r>
           </w:p>
           <w:p>
@@ -2670,7 +2223,7 @@
                 <w:szCs w:val="22"/>
                 <w:rtl w:val="0"/>
               </w:rPr>
-              <w:t xml:space="preserve">Semana 15-16-. Pruebas de integración, corrección de errores, ajustes de seguridad y optimización de rendimiento.</w:t>
+              <w:t xml:space="preserve">Semana 15-16-. Pruebas de integración, corrección de errores y ajustes de seguridad.</w:t>
             </w:r>
           </w:p>
           <w:p>
@@ -2691,6 +2244,11 @@
                 <w:rtl w:val="0"/>
               </w:rPr>
               <w:t xml:space="preserve">Semana 17-. Capacitación al cliente, despliegue en producción y acta de cierre del proyecto.</w:t>
+            </w:r>
+            <w:r>
+              <w:rPr>
+                <w:rtl w:val="0"/>
+              </w:rPr>
             </w:r>
           </w:p>
         </w:tc>
@@ -3877,7 +3435,6 @@
                 <w:rFonts w:ascii="Calibri" w:cs="Calibri" w:eastAsia="Calibri" w:hAnsi="Calibri"/>
                 <w:sz w:val="22"/>
                 <w:szCs w:val="22"/>
-                <w:u w:val="none"/>
               </w:rPr>
             </w:pPr>
             <w:r>
@@ -3888,11 +3445,6 @@
                 <w:rtl w:val="0"/>
               </w:rPr>
               <w:t xml:space="preserve">Fallas técnicas durante el desarrollo que retrasen la entrega.</w:t>
-            </w:r>
-            <w:r>
-              <w:rPr>
-                <w:rtl w:val="0"/>
-              </w:rPr>
             </w:r>
           </w:p>
           <w:p>
@@ -3907,22 +3459,16 @@
                 <w:rFonts w:ascii="Calibri" w:cs="Calibri" w:eastAsia="Calibri" w:hAnsi="Calibri"/>
                 <w:sz w:val="22"/>
                 <w:szCs w:val="22"/>
-                <w:u w:val="none"/>
-              </w:rPr>
-            </w:pPr>
-            <w:r>
-              <w:rPr>
-                <w:rFonts w:ascii="Calibri" w:cs="Calibri" w:eastAsia="Calibri" w:hAnsi="Calibri"/>
-                <w:sz w:val="22"/>
-                <w:szCs w:val="22"/>
-                <w:rtl w:val="0"/>
-              </w:rPr>
-              <w:t xml:space="preserve">Dificultad de aprendizaje por parte de los clientes ya establecidos para usar la nueva plataforma.</w:t>
-            </w:r>
-            <w:r>
-              <w:rPr>
-                <w:rtl w:val="0"/>
-              </w:rPr>
+              </w:rPr>
+            </w:pPr>
+            <w:r>
+              <w:rPr>
+                <w:rFonts w:ascii="Calibri" w:cs="Calibri" w:eastAsia="Calibri" w:hAnsi="Calibri"/>
+                <w:sz w:val="22"/>
+                <w:szCs w:val="22"/>
+                <w:rtl w:val="0"/>
+              </w:rPr>
+              <w:t xml:space="preserve">Dificultad de aprendizaje por parte de los usuarios para usar la nueva plataforma.</w:t>
             </w:r>
           </w:p>
           <w:p>
@@ -3937,22 +3483,16 @@
                 <w:rFonts w:ascii="Calibri" w:cs="Calibri" w:eastAsia="Calibri" w:hAnsi="Calibri"/>
                 <w:sz w:val="22"/>
                 <w:szCs w:val="22"/>
-                <w:u w:val="none"/>
-              </w:rPr>
-            </w:pPr>
-            <w:r>
-              <w:rPr>
-                <w:rFonts w:ascii="Calibri" w:cs="Calibri" w:eastAsia="Calibri" w:hAnsi="Calibri"/>
-                <w:sz w:val="22"/>
-                <w:szCs w:val="22"/>
-                <w:rtl w:val="0"/>
-              </w:rPr>
-              <w:t xml:space="preserve">Posibles problemas de compatibilidad en dispositivos móviles.</w:t>
-            </w:r>
-            <w:r>
-              <w:rPr>
-                <w:rtl w:val="0"/>
-              </w:rPr>
+              </w:rPr>
+            </w:pPr>
+            <w:r>
+              <w:rPr>
+                <w:rFonts w:ascii="Calibri" w:cs="Calibri" w:eastAsia="Calibri" w:hAnsi="Calibri"/>
+                <w:sz w:val="22"/>
+                <w:szCs w:val="22"/>
+                <w:rtl w:val="0"/>
+              </w:rPr>
+              <w:t xml:space="preserve">Posibles problemas de compatibilidad en dispositivos móviles específicos.</w:t>
             </w:r>
           </w:p>
           <w:p>
@@ -3967,22 +3507,16 @@
                 <w:rFonts w:ascii="Calibri" w:cs="Calibri" w:eastAsia="Calibri" w:hAnsi="Calibri"/>
                 <w:sz w:val="22"/>
                 <w:szCs w:val="22"/>
-                <w:u w:val="none"/>
-              </w:rPr>
-            </w:pPr>
-            <w:r>
-              <w:rPr>
-                <w:rFonts w:ascii="Calibri" w:cs="Calibri" w:eastAsia="Calibri" w:hAnsi="Calibri"/>
-                <w:sz w:val="22"/>
-                <w:szCs w:val="22"/>
-                <w:rtl w:val="0"/>
-              </w:rPr>
-              <w:t xml:space="preserve">Retraso en la integración de la pasarela de pago.</w:t>
-            </w:r>
-            <w:r>
-              <w:rPr>
-                <w:rtl w:val="0"/>
-              </w:rPr>
+              </w:rPr>
+            </w:pPr>
+            <w:r>
+              <w:rPr>
+                <w:rFonts w:ascii="Calibri" w:cs="Calibri" w:eastAsia="Calibri" w:hAnsi="Calibri"/>
+                <w:sz w:val="22"/>
+                <w:szCs w:val="22"/>
+                <w:rtl w:val="0"/>
+              </w:rPr>
+              <w:t xml:space="preserve">Resistencia al cambio por parte de clientes acostumbrados a comprar por WhatsApp o Marketplace.</w:t>
             </w:r>
           </w:p>
           <w:p>
@@ -4007,24 +3541,8 @@
                 <w:szCs w:val="22"/>
                 <w:rtl w:val="0"/>
               </w:rPr>
-              <w:t xml:space="preserve">Resistencia al cambio por parte de los clientes acostumbrados a comprar por WhatsApp o Marketplace.</w:t>
-            </w:r>
-            <w:r>
-              <w:rPr>
-                <w:rtl w:val="0"/>
-              </w:rPr>
-            </w:r>
-          </w:p>
-          <w:p>
-            <w:pPr>
-              <w:spacing w:line="259" w:lineRule="auto"/>
-              <w:ind w:left="0" w:right="0" w:firstLine="0"/>
-              <w:rPr>
-                <w:rFonts w:ascii="Calibri" w:cs="Calibri" w:eastAsia="Calibri" w:hAnsi="Calibri"/>
-                <w:sz w:val="18"/>
-                <w:szCs w:val="18"/>
-              </w:rPr>
-            </w:pPr>
+              <w:t xml:space="preserve">Vulnerabilidades de seguridad.</w:t>
+            </w:r>
             <w:r>
               <w:rPr>
                 <w:rtl w:val="0"/>
@@ -4087,21 +3605,37 @@
           <w:p>
             <w:pPr>
               <w:spacing w:line="259" w:lineRule="auto"/>
-              <w:ind w:left="0" w:right="0" w:firstLine="0"/>
-              <w:rPr>
-                <w:rFonts w:ascii="Calibri" w:cs="Calibri" w:eastAsia="Calibri" w:hAnsi="Calibri"/>
-                <w:sz w:val="22"/>
-                <w:szCs w:val="22"/>
-              </w:rPr>
-            </w:pPr>
-            <w:r>
-              <w:rPr>
-                <w:rFonts w:ascii="Calibri" w:cs="Calibri" w:eastAsia="Calibri" w:hAnsi="Calibri"/>
-                <w:sz w:val="22"/>
-                <w:szCs w:val="22"/>
-                <w:rtl w:val="0"/>
-              </w:rPr>
-              <w:t xml:space="preserve">El proyecto se ajusta al tiempo disponible del semestre (17 semanas) y a los recursos técnicos necesarios (computadores y acceso a internet). Se considera factible su desarrollo, ya que el equipo cuenta con las competencias requeridas para abordar las distintas etapas: diseño, programación, gestión de base de datos y pruebas. Además, el impacto esperado no solo optimiza los procesos de la pyme, sino que también mejora la experiencia de compra de los clientes, fomentando la digitalización del negocio.</w:t>
+              <w:ind w:left="0" w:right="0"/>
+              <w:rPr>
+                <w:rFonts w:ascii="Calibri" w:cs="Calibri" w:eastAsia="Calibri" w:hAnsi="Calibri"/>
+                <w:sz w:val="22"/>
+                <w:szCs w:val="22"/>
+              </w:rPr>
+            </w:pPr>
+            <w:r>
+              <w:rPr>
+                <w:rFonts w:ascii="Calibri" w:cs="Calibri" w:eastAsia="Calibri" w:hAnsi="Calibri"/>
+                <w:sz w:val="22"/>
+                <w:szCs w:val="22"/>
+                <w:rtl w:val="0"/>
+              </w:rPr>
+              <w:t xml:space="preserve">El proyecto se ajusta al tiempo disponible del semestre (17 semanas) y a los recursos técnicos necesarios (computadores y acceso a internet). Se considera altamente factible su desarrollo, ya que el equipo cuenta con las competencias requeridas para abordar las distintas etapas: diseño con Bootstrap 5, programación backend con Django 5.2, gestión de bases de datos PostgreSQL 17, y pruebas de calidad.</w:t>
+            </w:r>
+          </w:p>
+          <w:p>
+            <w:pPr>
+              <w:spacing w:line="259" w:lineRule="auto"/>
+              <w:ind w:left="0" w:right="0"/>
+              <w:rPr>
+                <w:rFonts w:ascii="Calibri" w:cs="Calibri" w:eastAsia="Calibri" w:hAnsi="Calibri"/>
+                <w:sz w:val="22"/>
+                <w:szCs w:val="22"/>
+              </w:rPr>
+            </w:pPr>
+            <w:r>
+              <w:rPr>
+                <w:rtl w:val="0"/>
+              </w:rPr>
             </w:r>
           </w:p>
           <w:p>
@@ -4114,6 +3648,15 @@
                 <w:szCs w:val="18"/>
               </w:rPr>
             </w:pPr>
+            <w:r>
+              <w:rPr>
+                <w:rFonts w:ascii="Calibri" w:cs="Calibri" w:eastAsia="Calibri" w:hAnsi="Calibri"/>
+                <w:sz w:val="22"/>
+                <w:szCs w:val="22"/>
+                <w:rtl w:val="0"/>
+              </w:rPr>
+              <w:t xml:space="preserve">Además, el impacto esperado no solo optimiza los procesos de la pyme, sino que también mejora significativamente la experiencia de compra de los clientes, fomentando la transformación digital del negocio con una plataforma profesional, segura y escalable alojada en DigitalOcean.</w:t>
+            </w:r>
             <w:r>
               <w:rPr>
                 <w:rtl w:val="0"/>
@@ -4139,8 +3682,8 @@
     </w:p>
     <w:sectPr>
       <w:headerReference r:id="rId7" w:type="default"/>
-      <w:pgSz w:h="15840" w:w="12240" w:orient="portrait"/>
-      <w:pgMar w:bottom="460" w:top="556" w:left="600" w:right="864" w:header="720" w:footer="720"/>
+      <w:pgSz w:h="18720" w:w="12240" w:orient="portrait"/>
+      <w:pgMar w:bottom="459.212598425197" w:top="555.5905511811025" w:left="600.9448818897638" w:right="861.732283464567" w:header="720" w:footer="720"/>
       <w:pgNumType w:start="1"/>
     </w:sectPr>
   </w:body>
@@ -5060,226 +4603,6 @@
       </w:rPr>
     </w:lvl>
   </w:abstractNum>
-  <w:abstractNum w:abstractNumId="7">
-    <w:lvl w:ilvl="0">
-      <w:start w:val="1"/>
-      <w:numFmt w:val="bullet"/>
-      <w:lvlText w:val="●"/>
-      <w:lvlJc w:val="left"/>
-      <w:pPr>
-        <w:ind w:left="720" w:hanging="360"/>
-      </w:pPr>
-      <w:rPr>
-        <w:u w:val="none"/>
-      </w:rPr>
-    </w:lvl>
-    <w:lvl w:ilvl="1">
-      <w:start w:val="1"/>
-      <w:numFmt w:val="bullet"/>
-      <w:lvlText w:val="○"/>
-      <w:lvlJc w:val="left"/>
-      <w:pPr>
-        <w:ind w:left="1440" w:hanging="360"/>
-      </w:pPr>
-      <w:rPr>
-        <w:u w:val="none"/>
-      </w:rPr>
-    </w:lvl>
-    <w:lvl w:ilvl="2">
-      <w:start w:val="1"/>
-      <w:numFmt w:val="bullet"/>
-      <w:lvlText w:val="■"/>
-      <w:lvlJc w:val="left"/>
-      <w:pPr>
-        <w:ind w:left="2160" w:hanging="360"/>
-      </w:pPr>
-      <w:rPr>
-        <w:u w:val="none"/>
-      </w:rPr>
-    </w:lvl>
-    <w:lvl w:ilvl="3">
-      <w:start w:val="1"/>
-      <w:numFmt w:val="bullet"/>
-      <w:lvlText w:val="●"/>
-      <w:lvlJc w:val="left"/>
-      <w:pPr>
-        <w:ind w:left="2880" w:hanging="360"/>
-      </w:pPr>
-      <w:rPr>
-        <w:u w:val="none"/>
-      </w:rPr>
-    </w:lvl>
-    <w:lvl w:ilvl="4">
-      <w:start w:val="1"/>
-      <w:numFmt w:val="bullet"/>
-      <w:lvlText w:val="○"/>
-      <w:lvlJc w:val="left"/>
-      <w:pPr>
-        <w:ind w:left="3600" w:hanging="360"/>
-      </w:pPr>
-      <w:rPr>
-        <w:u w:val="none"/>
-      </w:rPr>
-    </w:lvl>
-    <w:lvl w:ilvl="5">
-      <w:start w:val="1"/>
-      <w:numFmt w:val="bullet"/>
-      <w:lvlText w:val="■"/>
-      <w:lvlJc w:val="left"/>
-      <w:pPr>
-        <w:ind w:left="4320" w:hanging="360"/>
-      </w:pPr>
-      <w:rPr>
-        <w:u w:val="none"/>
-      </w:rPr>
-    </w:lvl>
-    <w:lvl w:ilvl="6">
-      <w:start w:val="1"/>
-      <w:numFmt w:val="bullet"/>
-      <w:lvlText w:val="●"/>
-      <w:lvlJc w:val="left"/>
-      <w:pPr>
-        <w:ind w:left="5040" w:hanging="360"/>
-      </w:pPr>
-      <w:rPr>
-        <w:u w:val="none"/>
-      </w:rPr>
-    </w:lvl>
-    <w:lvl w:ilvl="7">
-      <w:start w:val="1"/>
-      <w:numFmt w:val="bullet"/>
-      <w:lvlText w:val="○"/>
-      <w:lvlJc w:val="left"/>
-      <w:pPr>
-        <w:ind w:left="5760" w:hanging="360"/>
-      </w:pPr>
-      <w:rPr>
-        <w:u w:val="none"/>
-      </w:rPr>
-    </w:lvl>
-    <w:lvl w:ilvl="8">
-      <w:start w:val="1"/>
-      <w:numFmt w:val="bullet"/>
-      <w:lvlText w:val="■"/>
-      <w:lvlJc w:val="left"/>
-      <w:pPr>
-        <w:ind w:left="6480" w:hanging="360"/>
-      </w:pPr>
-      <w:rPr>
-        <w:u w:val="none"/>
-      </w:rPr>
-    </w:lvl>
-  </w:abstractNum>
-  <w:abstractNum w:abstractNumId="8">
-    <w:lvl w:ilvl="0">
-      <w:start w:val="1"/>
-      <w:numFmt w:val="bullet"/>
-      <w:lvlText w:val="●"/>
-      <w:lvlJc w:val="left"/>
-      <w:pPr>
-        <w:ind w:left="720" w:hanging="360"/>
-      </w:pPr>
-      <w:rPr>
-        <w:u w:val="none"/>
-      </w:rPr>
-    </w:lvl>
-    <w:lvl w:ilvl="1">
-      <w:start w:val="1"/>
-      <w:numFmt w:val="bullet"/>
-      <w:lvlText w:val="○"/>
-      <w:lvlJc w:val="left"/>
-      <w:pPr>
-        <w:ind w:left="1440" w:hanging="360"/>
-      </w:pPr>
-      <w:rPr>
-        <w:u w:val="none"/>
-      </w:rPr>
-    </w:lvl>
-    <w:lvl w:ilvl="2">
-      <w:start w:val="1"/>
-      <w:numFmt w:val="bullet"/>
-      <w:lvlText w:val="■"/>
-      <w:lvlJc w:val="left"/>
-      <w:pPr>
-        <w:ind w:left="2160" w:hanging="360"/>
-      </w:pPr>
-      <w:rPr>
-        <w:u w:val="none"/>
-      </w:rPr>
-    </w:lvl>
-    <w:lvl w:ilvl="3">
-      <w:start w:val="1"/>
-      <w:numFmt w:val="bullet"/>
-      <w:lvlText w:val="●"/>
-      <w:lvlJc w:val="left"/>
-      <w:pPr>
-        <w:ind w:left="2880" w:hanging="360"/>
-      </w:pPr>
-      <w:rPr>
-        <w:u w:val="none"/>
-      </w:rPr>
-    </w:lvl>
-    <w:lvl w:ilvl="4">
-      <w:start w:val="1"/>
-      <w:numFmt w:val="bullet"/>
-      <w:lvlText w:val="○"/>
-      <w:lvlJc w:val="left"/>
-      <w:pPr>
-        <w:ind w:left="3600" w:hanging="360"/>
-      </w:pPr>
-      <w:rPr>
-        <w:u w:val="none"/>
-      </w:rPr>
-    </w:lvl>
-    <w:lvl w:ilvl="5">
-      <w:start w:val="1"/>
-      <w:numFmt w:val="bullet"/>
-      <w:lvlText w:val="■"/>
-      <w:lvlJc w:val="left"/>
-      <w:pPr>
-        <w:ind w:left="4320" w:hanging="360"/>
-      </w:pPr>
-      <w:rPr>
-        <w:u w:val="none"/>
-      </w:rPr>
-    </w:lvl>
-    <w:lvl w:ilvl="6">
-      <w:start w:val="1"/>
-      <w:numFmt w:val="bullet"/>
-      <w:lvlText w:val="●"/>
-      <w:lvlJc w:val="left"/>
-      <w:pPr>
-        <w:ind w:left="5040" w:hanging="360"/>
-      </w:pPr>
-      <w:rPr>
-        <w:u w:val="none"/>
-      </w:rPr>
-    </w:lvl>
-    <w:lvl w:ilvl="7">
-      <w:start w:val="1"/>
-      <w:numFmt w:val="bullet"/>
-      <w:lvlText w:val="○"/>
-      <w:lvlJc w:val="left"/>
-      <w:pPr>
-        <w:ind w:left="5760" w:hanging="360"/>
-      </w:pPr>
-      <w:rPr>
-        <w:u w:val="none"/>
-      </w:rPr>
-    </w:lvl>
-    <w:lvl w:ilvl="8">
-      <w:start w:val="1"/>
-      <w:numFmt w:val="bullet"/>
-      <w:lvlText w:val="■"/>
-      <w:lvlJc w:val="left"/>
-      <w:pPr>
-        <w:ind w:left="6480" w:hanging="360"/>
-      </w:pPr>
-      <w:rPr>
-        <w:u w:val="none"/>
-      </w:rPr>
-    </w:lvl>
-  </w:abstractNum>
   <w:num w:numId="1">
     <w:abstractNumId w:val="1"/>
   </w:num>
@@ -5297,12 +4620,6 @@
   </w:num>
   <w:num w:numId="6">
     <w:abstractNumId w:val="6"/>
-  </w:num>
-  <w:num w:numId="7">
-    <w:abstractNumId w:val="7"/>
-  </w:num>
-  <w:num w:numId="8">
-    <w:abstractNumId w:val="8"/>
   </w:num>
 </w:numbering>
 </file>
@@ -5460,6 +4777,20 @@
       <w:szCs w:val="72"/>
     </w:rPr>
   </w:style>
+  <w:style w:type="table" w:styleId="TableNormal" w:default="1">
+    <w:name w:val="TableNormal"/>
+    <w:tblPr>
+      <w:tblCellMar>
+        <w:top w:w="100.0" w:type="dxa"/>
+        <w:left w:w="100.0" w:type="dxa"/>
+        <w:bottom w:w="100.0" w:type="dxa"/>
+        <w:right w:w="100.0" w:type="dxa"/>
+      </w:tblCellMar>
+    </w:tblPr>
+  </w:style>
+  <w:style w:type="paragraph" w:styleId="Normal" w:default="1">
+    <w:name w:val="normal"/>
+  </w:style>
   <w:style w:type="paragraph" w:styleId="Normal" w:default="1">
     <w:name w:val="normal"/>
   </w:style>
@@ -5569,6 +4900,70 @@
       <w:color w:val="000000"/>
       <w:sz w:val="21"/>
     </w:rPr>
+  </w:style>
+  <w:style w:type="table" w:styleId="Table1">
+    <w:basedOn w:val="TableNormal"/>
+    <w:pPr>
+      <w:spacing w:after="0" w:line="240" w:lineRule="auto"/>
+    </w:pPr>
+    <w:tblPr>
+      <w:tblStyleRowBandSize w:val="1"/>
+      <w:tblStyleColBandSize w:val="1"/>
+      <w:tblCellMar>
+        <w:top w:w="53.0" w:type="dxa"/>
+        <w:left w:w="46.0" w:type="dxa"/>
+        <w:bottom w:w="0.0" w:type="dxa"/>
+        <w:right w:w="115.0" w:type="dxa"/>
+      </w:tblCellMar>
+    </w:tblPr>
+  </w:style>
+  <w:style w:type="table" w:styleId="Table2">
+    <w:basedOn w:val="TableNormal"/>
+    <w:pPr>
+      <w:spacing w:after="0" w:line="240" w:lineRule="auto"/>
+    </w:pPr>
+    <w:tblPr>
+      <w:tblStyleRowBandSize w:val="1"/>
+      <w:tblStyleColBandSize w:val="1"/>
+      <w:tblCellMar>
+        <w:top w:w="49.0" w:type="dxa"/>
+        <w:left w:w="10.0" w:type="dxa"/>
+        <w:bottom w:w="68.0" w:type="dxa"/>
+        <w:right w:w="65.0" w:type="dxa"/>
+      </w:tblCellMar>
+    </w:tblPr>
+  </w:style>
+  <w:style w:type="table" w:styleId="Table3">
+    <w:basedOn w:val="TableNormal"/>
+    <w:pPr>
+      <w:spacing w:after="0" w:line="240" w:lineRule="auto"/>
+    </w:pPr>
+    <w:tblPr>
+      <w:tblStyleRowBandSize w:val="1"/>
+      <w:tblStyleColBandSize w:val="1"/>
+      <w:tblCellMar>
+        <w:top w:w="49.0" w:type="dxa"/>
+        <w:left w:w="10.0" w:type="dxa"/>
+        <w:bottom w:w="68.0" w:type="dxa"/>
+        <w:right w:w="65.0" w:type="dxa"/>
+      </w:tblCellMar>
+    </w:tblPr>
+  </w:style>
+  <w:style w:type="table" w:styleId="Table4">
+    <w:basedOn w:val="TableNormal"/>
+    <w:pPr>
+      <w:spacing w:after="0" w:line="240" w:lineRule="auto"/>
+    </w:pPr>
+    <w:tblPr>
+      <w:tblStyleRowBandSize w:val="1"/>
+      <w:tblStyleColBandSize w:val="1"/>
+      <w:tblCellMar>
+        <w:top w:w="49.0" w:type="dxa"/>
+        <w:left w:w="10.0" w:type="dxa"/>
+        <w:bottom w:w="68.0" w:type="dxa"/>
+        <w:right w:w="65.0" w:type="dxa"/>
+      </w:tblCellMar>
+    </w:tblPr>
   </w:style>
   <w:style w:type="table" w:styleId="Table1">
     <w:basedOn w:val="TableNormal"/>
@@ -6037,7 +5432,7 @@
 
 <file path=customXML/item1.xml><?xml version="1.0" encoding="utf-8"?>
 <go:gDocsCustomXmlDataStorage xmlns:go="http://customooxmlschemas.google.com/" xmlns:r="http://schemas.openxmlformats.org/officeDocument/2006/relationships" uri="GoogleDocsCustomDataVersion2">
-  <go:docsCustomData xmlns:go="http://customooxmlschemas.google.com/" roundtripDataSignature="AMtx7mirThL7Cm0Ok5TO9kLhQYVIOldiIg==">CgMxLjAyDWguZ2F1dGdnbHU2dnIyDmgud3NmZnp5ZW0wYzF1Mg5oLmk4NmYwbmJkbHBpYjIOaC5qMjdxZDRwbG5iOWIyDmguMThqdW5vYjI1MGFwMg5oLmw0dWJrdHNtcWp0ZDgAciExbmVGamx0M19idmNBRnc1V3VtNlVTYmZyS3N5NmRXUUM=</go:docsCustomData>
+  <go:docsCustomData xmlns:go="http://customooxmlschemas.google.com/" roundtripDataSignature="AMtx7mir7xRmT4dX6dF+3qh/SNG39cv7LA==">CgMxLjAyDWguZ2F1dGdnbHU2dnIyDmgud3NmZnp5ZW0wYzF1Mg5oLmk4NmYwbmJkbHBpYjIOaC5qMjdxZDRwbG5iOWIyDmgubDR1Ymt0c21xanRkOAByITFVdnl4b0cwcE5iTzVhU0VZYlB5ckRjSVZPQ2pzVm9ISQ==</go:docsCustomData>
 </go:gDocsCustomXmlDataStorage>
 </file>
 

</xml_diff>